<commit_message>
OCS Cell: AI Inference Engine을 Triton 오픈소스(0원, 자체 구축)로 변경, NVIDIA AI Enterprise 구독 제외
Co-Authored-By: Claude Opus 5.5 <noreply@anthropic.com>
</commit_message>
<xml_diff>
--- a/docs/ocs_precision.docx
+++ b/docs/ocs_precision.docx
@@ -1154,7 +1154,7 @@
             </w:r>
             <w:r>
               <w:rPr/>
-              <w:t>1,784,200</w:t>
+              <w:t>1,759,000</w:t>
             </w:r>
             <w:r>
               <w:rPr/>
@@ -2866,11 +2866,11 @@
             </w:pPr>
             <w:r>
               <w:rPr/>
-              <w:t>Triton Inference Server + NVIDIA AI Enterprise (GPU 4</w:t>
-            </w:r>
-            <w:r>
-              <w:rPr/>
-              <w:t>장분</w:t>
+              <w:t>Triton Inference Server (</w:t>
+            </w:r>
+            <w:r>
+              <w:rPr/>
+              <w:t>오픈소스</w:t>
             </w:r>
             <w:r>
               <w:rPr/>
@@ -7784,7 +7784,7 @@
             </w:pPr>
             <w:r>
               <w:rPr/>
-              <w:t>333,200</w:t>
+              <w:t>308,000</w:t>
             </w:r>
           </w:p>
         </w:tc>
@@ -8210,7 +8210,7 @@
             </w:pPr>
             <w:r>
               <w:rPr/>
-              <w:t>1,784,200</w:t>
+              <w:t>1,759,000</w:t>
             </w:r>
           </w:p>
         </w:tc>
@@ -8472,7 +8472,7 @@
             </w:pPr>
             <w:r>
               <w:rPr/>
-              <w:t>2,617,200</w:t>
+              <w:t>2,592,000</w:t>
             </w:r>
           </w:p>
         </w:tc>
@@ -10153,7 +10153,7 @@
             </w:r>
             <w:r>
               <w:rPr/>
-              <w:t xml:space="preserve">: Triton Inference Server + NVIDIA AI Enterprise · Apache Airflow </w:t>
+              <w:t xml:space="preserve">: Triton Inference Server · Apache Airflow </w:t>
             </w:r>
             <w:r>
               <w:rPr/>
@@ -22454,7 +22454,7 @@
       </w:r>
       <w:r>
         <w:rPr/>
-        <w:t>(Kepware·Cocktail Cloud·Machbase·NVIDIA AI Enterprise·HiveMQ·DMWorks·HIWARE)</w:t>
+        <w:t>(Kepware·Cocktail Cloud·Machbase·HiveMQ·DMWorks·HIWARE)</w:t>
       </w:r>
       <w:r>
         <w:rPr/>
@@ -22510,7 +22510,7 @@
       </w:r>
       <w:r>
         <w:rPr/>
-        <w:t>(HiveMQ·NVIDIA AI Enterprise)</w:t>
+        <w:t>(HiveMQ)</w:t>
       </w:r>
       <w:r>
         <w:rPr/>
@@ -26870,7 +26870,7 @@
             </w:pPr>
             <w:r>
               <w:rPr/>
-              <w:t>130,200</w:t>
+              <w:t>105,000</w:t>
             </w:r>
           </w:p>
         </w:tc>
@@ -29680,15 +29680,15 @@
             </w:pPr>
             <w:r>
               <w:rPr/>
-              <w:t>Triton Inference Server + NVIDIA AI Enterprise (GPU 4·1</w:t>
-            </w:r>
-            <w:r>
-              <w:rPr/>
-              <w:t>년</w:t>
-            </w:r>
-            <w:r>
-              <w:rPr/>
-              <w:t>)</w:t>
+              <w:t>Triton Inference Server (</w:t>
+            </w:r>
+            <w:r>
+              <w:rPr/>
+              <w:t>오픈소스</w:t>
+            </w:r>
+            <w:r>
+              <w:rPr/>
+              <w:t>, BSD)</w:t>
             </w:r>
           </w:p>
         </w:tc>
@@ -29716,7 +29716,7 @@
             </w:r>
             <w:r>
               <w:rPr/>
-              <w:t>미국</w:t>
+              <w:t>오픈소스</w:t>
             </w:r>
             <w:r>
               <w:rPr/>
@@ -29796,7 +29796,7 @@
             </w:pPr>
             <w:r>
               <w:rPr/>
-              <w:t>25,200</w:t>
+              <w:t>0</w:t>
             </w:r>
           </w:p>
         </w:tc>
@@ -29820,7 +29820,7 @@
             </w:pPr>
             <w:r>
               <w:rPr/>
-              <w:t>25,200</w:t>
+              <w:t>0</w:t>
             </w:r>
           </w:p>
         </w:tc>
@@ -29996,35 +29996,11 @@
             </w:r>
             <w:r>
               <w:rPr/>
-              <w:t xml:space="preserve">서버 </w:t>
-            </w:r>
-            <w:r>
-              <w:rPr/>
-              <w:t>1</w:t>
-            </w:r>
-            <w:r>
-              <w:rPr/>
-              <w:t>대</w:t>
-            </w:r>
-            <w:r>
-              <w:rPr/>
-              <w:t>(GPU 4</w:t>
-            </w:r>
-            <w:r>
-              <w:rPr/>
-              <w:t>장</w:t>
-            </w:r>
-            <w:r>
-              <w:rPr/>
-              <w:t xml:space="preserve">) </w:t>
-            </w:r>
-            <w:r>
-              <w:rPr/>
-              <w:t xml:space="preserve">기준 </w:t>
-            </w:r>
-            <w:r>
-              <w:rPr/>
-              <w:t>1</w:t>
+              <w:t>서버</w:t>
+            </w:r>
+            <w:r>
+              <w:rPr/>
+              <w:t>(GPU-1) 1</w:t>
             </w:r>
             <w:r>
               <w:rPr/>
@@ -30052,11 +30028,47 @@
             </w:pPr>
             <w:r>
               <w:rPr/>
-              <w:t>[</w:t>
-            </w:r>
-            <w:r>
-              <w:rPr/>
-              <w:t>공개가</w:t>
+              <w:t>연구 인력 자체 개발</w:t>
+            </w:r>
+            <w:r>
+              <w:rPr/>
+              <w:t>(</w:t>
+            </w:r>
+            <w:r>
+              <w:rPr/>
+              <w:t>오픈소스 기반</w:t>
+            </w:r>
+            <w:r>
+              <w:rPr/>
+              <w:t xml:space="preserve">, </w:t>
+            </w:r>
+            <w:r>
+              <w:rPr/>
+              <w:t>인건비 처리</w:t>
+            </w:r>
+            <w:r>
+              <w:rPr/>
+              <w:t xml:space="preserve">). NVIDIA AI Enterprise </w:t>
+            </w:r>
+            <w:r>
+              <w:rPr/>
+              <w:t>구독</w:t>
+            </w:r>
+            <w:r>
+              <w:rPr/>
+              <w:t>($4,500/GPU/</w:t>
+            </w:r>
+            <w:r>
+              <w:rPr/>
+              <w:t>년</w:t>
+            </w:r>
+            <w:r>
+              <w:rPr/>
+              <w:t>)</w:t>
+            </w:r>
+            <w:r>
+              <w:rPr/>
+              <w:t>은 기술 지원</w:t>
             </w:r>
             <w:r>
               <w:rPr/>
@@ -30064,19 +30076,15 @@
             </w:r>
             <w:r>
               <w:rPr/>
-              <w:t>확인</w:t>
-            </w:r>
-            <w:r>
-              <w:rPr/>
-              <w:t>] $4,500/GPU/</w:t>
-            </w:r>
-            <w:r>
-              <w:rPr/>
-              <w:t xml:space="preserve">년 </w:t>
-            </w:r>
-            <w:r>
-              <w:rPr/>
-              <w:t>× 4 = $18,000 ≈ 25,200</w:t>
+              <w:t>장기 지원 버전용이라 제외</w:t>
+            </w:r>
+            <w:r>
+              <w:rPr/>
+              <w:t xml:space="preserve">, </w:t>
+            </w:r>
+            <w:r>
+              <w:rPr/>
+              <w:t>상용 운영 전환 시 재검토</w:t>
             </w:r>
           </w:p>
         </w:tc>
@@ -30115,13 +30123,7 @@
                 <w:rPr>
                   <w:rStyle w:val="Hyperlink"/>
                 </w:rPr>
-                <w:t xml:space="preserve">AI Enterprise </w:t>
-              </w:r>
-              <w:r>
-                <w:rPr>
-                  <w:rStyle w:val="Hyperlink"/>
-                </w:rPr>
-                <w:t>가격 ↗</w:t>
+                <w:t>Triton (GitHub, BSD) ↗</w:t>
               </w:r>
             </w:hyperlink>
             <w:bookmarkStart w:id="35" w:name="sw-ETL"/>
@@ -34977,7 +34979,7 @@
             </w:pPr>
             <w:r>
               <w:rPr/>
-              <w:t xml:space="preserve">333,200 </w:t>
+              <w:t xml:space="preserve">308,000 </w:t>
             </w:r>
             <w:r>
               <w:rPr/>
@@ -45202,10 +45204,10 @@
       </w:tblPr>
       <w:tblGrid>
         <w:gridCol w:w="754"/>
-        <w:gridCol w:w="1007"/>
-        <w:gridCol w:w="4425"/>
-        <w:gridCol w:w="2442"/>
-        <w:gridCol w:w="2711"/>
+        <w:gridCol w:w="1014"/>
+        <w:gridCol w:w="4325"/>
+        <w:gridCol w:w="2486"/>
+        <w:gridCol w:w="2760"/>
       </w:tblGrid>
       <w:tr>
         <w:trPr>
@@ -45240,7 +45242,7 @@
         </w:tc>
         <w:tc>
           <w:tcPr>
-            <w:tcW w:w="1007" w:type="dxa"/>
+            <w:tcW w:w="1014" w:type="dxa"/>
             <w:tcBorders>
               <w:top w:val="single" w:sz="6" w:space="0" w:color="808080"/>
               <w:left w:val="single" w:sz="2" w:space="0" w:color="808080"/>
@@ -45267,7 +45269,7 @@
         </w:tc>
         <w:tc>
           <w:tcPr>
-            <w:tcW w:w="4425" w:type="dxa"/>
+            <w:tcW w:w="4325" w:type="dxa"/>
             <w:tcBorders>
               <w:top w:val="single" w:sz="6" w:space="0" w:color="808080"/>
               <w:left w:val="single" w:sz="2" w:space="0" w:color="808080"/>
@@ -45302,7 +45304,7 @@
         </w:tc>
         <w:tc>
           <w:tcPr>
-            <w:tcW w:w="2442" w:type="dxa"/>
+            <w:tcW w:w="2486" w:type="dxa"/>
             <w:tcBorders>
               <w:top w:val="single" w:sz="6" w:space="0" w:color="808080"/>
               <w:left w:val="single" w:sz="2" w:space="0" w:color="808080"/>
@@ -45329,7 +45331,7 @@
         </w:tc>
         <w:tc>
           <w:tcPr>
-            <w:tcW w:w="2711" w:type="dxa"/>
+            <w:tcW w:w="2760" w:type="dxa"/>
             <w:tcBorders>
               <w:top w:val="single" w:sz="6" w:space="0" w:color="808080"/>
               <w:left w:val="single" w:sz="2" w:space="0" w:color="808080"/>
@@ -45384,7 +45386,7 @@
         </w:tc>
         <w:tc>
           <w:tcPr>
-            <w:tcW w:w="1007" w:type="dxa"/>
+            <w:tcW w:w="1014" w:type="dxa"/>
             <w:tcBorders>
               <w:left w:val="single" w:sz="2" w:space="0" w:color="808080"/>
               <w:bottom w:val="single" w:sz="2" w:space="0" w:color="808080"/>
@@ -45413,7 +45415,7 @@
         </w:tc>
         <w:tc>
           <w:tcPr>
-            <w:tcW w:w="4425" w:type="dxa"/>
+            <w:tcW w:w="4325" w:type="dxa"/>
             <w:tcBorders>
               <w:left w:val="single" w:sz="2" w:space="0" w:color="808080"/>
               <w:bottom w:val="single" w:sz="2" w:space="0" w:color="808080"/>
@@ -45461,7 +45463,7 @@
         </w:tc>
         <w:tc>
           <w:tcPr>
-            <w:tcW w:w="2442" w:type="dxa"/>
+            <w:tcW w:w="2486" w:type="dxa"/>
             <w:tcBorders>
               <w:left w:val="single" w:sz="2" w:space="0" w:color="808080"/>
               <w:bottom w:val="single" w:sz="2" w:space="0" w:color="808080"/>
@@ -45485,7 +45487,7 @@
         </w:tc>
         <w:tc>
           <w:tcPr>
-            <w:tcW w:w="2711" w:type="dxa"/>
+            <w:tcW w:w="2760" w:type="dxa"/>
             <w:tcBorders>
               <w:left w:val="single" w:sz="2" w:space="0" w:color="808080"/>
               <w:bottom w:val="single" w:sz="2" w:space="0" w:color="808080"/>
@@ -45545,7 +45547,7 @@
         </w:tc>
         <w:tc>
           <w:tcPr>
-            <w:tcW w:w="1007" w:type="dxa"/>
+            <w:tcW w:w="1014" w:type="dxa"/>
             <w:tcBorders>
               <w:left w:val="single" w:sz="2" w:space="0" w:color="808080"/>
               <w:bottom w:val="single" w:sz="2" w:space="0" w:color="808080"/>
@@ -45574,7 +45576,7 @@
         </w:tc>
         <w:tc>
           <w:tcPr>
-            <w:tcW w:w="4425" w:type="dxa"/>
+            <w:tcW w:w="4325" w:type="dxa"/>
             <w:tcBorders>
               <w:left w:val="single" w:sz="2" w:space="0" w:color="808080"/>
               <w:bottom w:val="single" w:sz="2" w:space="0" w:color="808080"/>
@@ -45674,7 +45676,7 @@
         </w:tc>
         <w:tc>
           <w:tcPr>
-            <w:tcW w:w="2442" w:type="dxa"/>
+            <w:tcW w:w="2486" w:type="dxa"/>
             <w:tcBorders>
               <w:left w:val="single" w:sz="2" w:space="0" w:color="808080"/>
               <w:bottom w:val="single" w:sz="2" w:space="0" w:color="808080"/>
@@ -45698,7 +45700,7 @@
         </w:tc>
         <w:tc>
           <w:tcPr>
-            <w:tcW w:w="2711" w:type="dxa"/>
+            <w:tcW w:w="2760" w:type="dxa"/>
             <w:tcBorders>
               <w:left w:val="single" w:sz="2" w:space="0" w:color="808080"/>
               <w:bottom w:val="single" w:sz="2" w:space="0" w:color="808080"/>
@@ -45758,7 +45760,7 @@
         </w:tc>
         <w:tc>
           <w:tcPr>
-            <w:tcW w:w="1007" w:type="dxa"/>
+            <w:tcW w:w="1014" w:type="dxa"/>
             <w:tcBorders>
               <w:left w:val="single" w:sz="2" w:space="0" w:color="808080"/>
               <w:bottom w:val="single" w:sz="2" w:space="0" w:color="808080"/>
@@ -45793,7 +45795,7 @@
         </w:tc>
         <w:tc>
           <w:tcPr>
-            <w:tcW w:w="4425" w:type="dxa"/>
+            <w:tcW w:w="4325" w:type="dxa"/>
             <w:tcBorders>
               <w:left w:val="single" w:sz="2" w:space="0" w:color="808080"/>
               <w:bottom w:val="single" w:sz="2" w:space="0" w:color="808080"/>
@@ -45861,7 +45863,7 @@
         </w:tc>
         <w:tc>
           <w:tcPr>
-            <w:tcW w:w="2442" w:type="dxa"/>
+            <w:tcW w:w="2486" w:type="dxa"/>
             <w:tcBorders>
               <w:left w:val="single" w:sz="2" w:space="0" w:color="808080"/>
               <w:bottom w:val="single" w:sz="2" w:space="0" w:color="808080"/>
@@ -45901,7 +45903,7 @@
         </w:tc>
         <w:tc>
           <w:tcPr>
-            <w:tcW w:w="2711" w:type="dxa"/>
+            <w:tcW w:w="2760" w:type="dxa"/>
             <w:tcBorders>
               <w:left w:val="single" w:sz="2" w:space="0" w:color="808080"/>
               <w:bottom w:val="single" w:sz="2" w:space="0" w:color="808080"/>
@@ -45993,7 +45995,7 @@
         </w:tc>
         <w:tc>
           <w:tcPr>
-            <w:tcW w:w="1007" w:type="dxa"/>
+            <w:tcW w:w="1014" w:type="dxa"/>
             <w:tcBorders>
               <w:left w:val="single" w:sz="2" w:space="0" w:color="808080"/>
               <w:bottom w:val="single" w:sz="2" w:space="0" w:color="808080"/>
@@ -46028,25 +46030,25 @@
         </w:tc>
         <w:tc>
           <w:tcPr>
-            <w:tcW w:w="4425" w:type="dxa"/>
-            <w:tcBorders>
-              <w:left w:val="single" w:sz="2" w:space="0" w:color="808080"/>
-              <w:bottom w:val="single" w:sz="2" w:space="0" w:color="808080"/>
-              <w:right w:val="single" w:sz="6" w:space="0" w:color="808080"/>
-            </w:tcBorders>
-            <w:vAlign w:val="center"/>
-          </w:tcPr>
-          <w:p>
-            <w:pPr>
-              <w:pStyle w:val="TableContents"/>
-              <w:bidi w:val="0"/>
-              <w:spacing w:before="0" w:after="283"/>
-              <w:jc w:val="left"/>
-              <w:rPr/>
-            </w:pPr>
-            <w:r>
-              <w:rPr/>
-              <w:t>HiveMQ·NVIDIA AI Enterprise</w:t>
+            <w:tcW w:w="4325" w:type="dxa"/>
+            <w:tcBorders>
+              <w:left w:val="single" w:sz="2" w:space="0" w:color="808080"/>
+              <w:bottom w:val="single" w:sz="2" w:space="0" w:color="808080"/>
+              <w:right w:val="single" w:sz="6" w:space="0" w:color="808080"/>
+            </w:tcBorders>
+            <w:vAlign w:val="center"/>
+          </w:tcPr>
+          <w:p>
+            <w:pPr>
+              <w:pStyle w:val="TableContents"/>
+              <w:bidi w:val="0"/>
+              <w:spacing w:before="0" w:after="283"/>
+              <w:jc w:val="left"/>
+              <w:rPr/>
+            </w:pPr>
+            <w:r>
+              <w:rPr/>
+              <w:t>HiveMQ</w:t>
             </w:r>
             <w:r>
               <w:rPr/>
@@ -46062,13 +46064,25 @@
             </w:r>
             <w:r>
               <w:rPr/>
-              <w:t>)</w:t>
-            </w:r>
-          </w:p>
-        </w:tc>
-        <w:tc>
-          <w:tcPr>
-            <w:tcW w:w="2442" w:type="dxa"/>
+              <w:t>). Triton</w:t>
+            </w:r>
+            <w:r>
+              <w:rPr/>
+              <w:t xml:space="preserve">은 오픈소스로 바꿔 </w:t>
+            </w:r>
+            <w:r>
+              <w:rPr/>
+              <w:t xml:space="preserve">NVIDIA AI Enterprise </w:t>
+            </w:r>
+            <w:r>
+              <w:rPr/>
+              <w:t>구독 제외</w:t>
+            </w:r>
+          </w:p>
+        </w:tc>
+        <w:tc>
+          <w:tcPr>
+            <w:tcW w:w="2486" w:type="dxa"/>
             <w:tcBorders>
               <w:left w:val="single" w:sz="2" w:space="0" w:color="808080"/>
               <w:bottom w:val="single" w:sz="2" w:space="0" w:color="808080"/>
@@ -46092,7 +46106,7 @@
         </w:tc>
         <w:tc>
           <w:tcPr>
-            <w:tcW w:w="2711" w:type="dxa"/>
+            <w:tcW w:w="2760" w:type="dxa"/>
             <w:tcBorders>
               <w:left w:val="single" w:sz="2" w:space="0" w:color="808080"/>
               <w:bottom w:val="single" w:sz="2" w:space="0" w:color="808080"/>
@@ -46148,7 +46162,7 @@
         </w:tc>
         <w:tc>
           <w:tcPr>
-            <w:tcW w:w="1007" w:type="dxa"/>
+            <w:tcW w:w="1014" w:type="dxa"/>
             <w:tcBorders>
               <w:left w:val="single" w:sz="2" w:space="0" w:color="808080"/>
               <w:bottom w:val="single" w:sz="2" w:space="0" w:color="808080"/>
@@ -46177,7 +46191,7 @@
         </w:tc>
         <w:tc>
           <w:tcPr>
-            <w:tcW w:w="4425" w:type="dxa"/>
+            <w:tcW w:w="4325" w:type="dxa"/>
             <w:tcBorders>
               <w:left w:val="single" w:sz="2" w:space="0" w:color="808080"/>
               <w:bottom w:val="single" w:sz="2" w:space="0" w:color="808080"/>
@@ -46285,7 +46299,7 @@
         </w:tc>
         <w:tc>
           <w:tcPr>
-            <w:tcW w:w="2442" w:type="dxa"/>
+            <w:tcW w:w="2486" w:type="dxa"/>
             <w:tcBorders>
               <w:left w:val="single" w:sz="2" w:space="0" w:color="808080"/>
               <w:bottom w:val="single" w:sz="2" w:space="0" w:color="808080"/>
@@ -46309,7 +46323,7 @@
         </w:tc>
         <w:tc>
           <w:tcPr>
-            <w:tcW w:w="2711" w:type="dxa"/>
+            <w:tcW w:w="2760" w:type="dxa"/>
             <w:tcBorders>
               <w:left w:val="single" w:sz="2" w:space="0" w:color="808080"/>
               <w:bottom w:val="single" w:sz="2" w:space="0" w:color="808080"/>
@@ -46369,7 +46383,7 @@
         </w:tc>
         <w:tc>
           <w:tcPr>
-            <w:tcW w:w="1007" w:type="dxa"/>
+            <w:tcW w:w="1014" w:type="dxa"/>
             <w:tcBorders>
               <w:left w:val="single" w:sz="2" w:space="0" w:color="808080"/>
               <w:bottom w:val="single" w:sz="2" w:space="0" w:color="808080"/>
@@ -46404,7 +46418,7 @@
         </w:tc>
         <w:tc>
           <w:tcPr>
-            <w:tcW w:w="4425" w:type="dxa"/>
+            <w:tcW w:w="4325" w:type="dxa"/>
             <w:tcBorders>
               <w:left w:val="single" w:sz="2" w:space="0" w:color="808080"/>
               <w:bottom w:val="single" w:sz="2" w:space="0" w:color="808080"/>
@@ -46448,7 +46462,7 @@
         </w:tc>
         <w:tc>
           <w:tcPr>
-            <w:tcW w:w="2442" w:type="dxa"/>
+            <w:tcW w:w="2486" w:type="dxa"/>
             <w:tcBorders>
               <w:left w:val="single" w:sz="2" w:space="0" w:color="808080"/>
               <w:bottom w:val="single" w:sz="2" w:space="0" w:color="808080"/>
@@ -46480,7 +46494,7 @@
         </w:tc>
         <w:tc>
           <w:tcPr>
-            <w:tcW w:w="2711" w:type="dxa"/>
+            <w:tcW w:w="2760" w:type="dxa"/>
             <w:tcBorders>
               <w:left w:val="single" w:sz="2" w:space="0" w:color="808080"/>
               <w:bottom w:val="single" w:sz="2" w:space="0" w:color="808080"/>
@@ -46560,7 +46574,7 @@
         </w:tc>
         <w:tc>
           <w:tcPr>
-            <w:tcW w:w="1007" w:type="dxa"/>
+            <w:tcW w:w="1014" w:type="dxa"/>
             <w:tcBorders>
               <w:left w:val="single" w:sz="2" w:space="0" w:color="808080"/>
               <w:bottom w:val="single" w:sz="2" w:space="0" w:color="808080"/>
@@ -46595,7 +46609,7 @@
         </w:tc>
         <w:tc>
           <w:tcPr>
-            <w:tcW w:w="4425" w:type="dxa"/>
+            <w:tcW w:w="4325" w:type="dxa"/>
             <w:tcBorders>
               <w:left w:val="single" w:sz="2" w:space="0" w:color="808080"/>
               <w:bottom w:val="single" w:sz="2" w:space="0" w:color="808080"/>
@@ -46639,7 +46653,7 @@
         </w:tc>
         <w:tc>
           <w:tcPr>
-            <w:tcW w:w="2442" w:type="dxa"/>
+            <w:tcW w:w="2486" w:type="dxa"/>
             <w:tcBorders>
               <w:left w:val="single" w:sz="2" w:space="0" w:color="808080"/>
               <w:bottom w:val="single" w:sz="2" w:space="0" w:color="808080"/>
@@ -46667,7 +46681,7 @@
         </w:tc>
         <w:tc>
           <w:tcPr>
-            <w:tcW w:w="2711" w:type="dxa"/>
+            <w:tcW w:w="2760" w:type="dxa"/>
             <w:tcBorders>
               <w:left w:val="single" w:sz="2" w:space="0" w:color="808080"/>
               <w:bottom w:val="single" w:sz="2" w:space="0" w:color="808080"/>
@@ -46727,7 +46741,7 @@
         </w:tc>
         <w:tc>
           <w:tcPr>
-            <w:tcW w:w="1007" w:type="dxa"/>
+            <w:tcW w:w="1014" w:type="dxa"/>
             <w:tcBorders>
               <w:left w:val="single" w:sz="2" w:space="0" w:color="808080"/>
               <w:bottom w:val="single" w:sz="2" w:space="0" w:color="808080"/>
@@ -46756,7 +46770,7 @@
         </w:tc>
         <w:tc>
           <w:tcPr>
-            <w:tcW w:w="4425" w:type="dxa"/>
+            <w:tcW w:w="4325" w:type="dxa"/>
             <w:tcBorders>
               <w:left w:val="single" w:sz="2" w:space="0" w:color="808080"/>
               <w:bottom w:val="single" w:sz="2" w:space="0" w:color="808080"/>
@@ -46836,7 +46850,7 @@
         </w:tc>
         <w:tc>
           <w:tcPr>
-            <w:tcW w:w="2442" w:type="dxa"/>
+            <w:tcW w:w="2486" w:type="dxa"/>
             <w:tcBorders>
               <w:left w:val="single" w:sz="2" w:space="0" w:color="808080"/>
               <w:bottom w:val="single" w:sz="2" w:space="0" w:color="808080"/>
@@ -46872,7 +46886,7 @@
         </w:tc>
         <w:tc>
           <w:tcPr>
-            <w:tcW w:w="2711" w:type="dxa"/>
+            <w:tcW w:w="2760" w:type="dxa"/>
             <w:tcBorders>
               <w:left w:val="single" w:sz="2" w:space="0" w:color="808080"/>
               <w:bottom w:val="single" w:sz="2" w:space="0" w:color="808080"/>
@@ -46924,7 +46938,7 @@
         </w:tc>
         <w:tc>
           <w:tcPr>
-            <w:tcW w:w="1007" w:type="dxa"/>
+            <w:tcW w:w="1014" w:type="dxa"/>
             <w:tcBorders>
               <w:left w:val="single" w:sz="2" w:space="0" w:color="808080"/>
               <w:bottom w:val="single" w:sz="2" w:space="0" w:color="808080"/>
@@ -46953,7 +46967,7 @@
         </w:tc>
         <w:tc>
           <w:tcPr>
-            <w:tcW w:w="4425" w:type="dxa"/>
+            <w:tcW w:w="4325" w:type="dxa"/>
             <w:tcBorders>
               <w:left w:val="single" w:sz="2" w:space="0" w:color="808080"/>
               <w:bottom w:val="single" w:sz="2" w:space="0" w:color="808080"/>
@@ -47001,7 +47015,7 @@
         </w:tc>
         <w:tc>
           <w:tcPr>
-            <w:tcW w:w="2442" w:type="dxa"/>
+            <w:tcW w:w="2486" w:type="dxa"/>
             <w:tcBorders>
               <w:left w:val="single" w:sz="2" w:space="0" w:color="808080"/>
               <w:bottom w:val="single" w:sz="2" w:space="0" w:color="808080"/>
@@ -47045,7 +47059,7 @@
         </w:tc>
         <w:tc>
           <w:tcPr>
-            <w:tcW w:w="2711" w:type="dxa"/>
+            <w:tcW w:w="2760" w:type="dxa"/>
             <w:tcBorders>
               <w:left w:val="single" w:sz="2" w:space="0" w:color="808080"/>
               <w:bottom w:val="single" w:sz="2" w:space="0" w:color="808080"/>
@@ -47105,7 +47119,7 @@
         </w:tc>
         <w:tc>
           <w:tcPr>
-            <w:tcW w:w="1007" w:type="dxa"/>
+            <w:tcW w:w="1014" w:type="dxa"/>
             <w:tcBorders>
               <w:left w:val="single" w:sz="2" w:space="0" w:color="808080"/>
               <w:bottom w:val="single" w:sz="2" w:space="0" w:color="808080"/>
@@ -47134,7 +47148,7 @@
         </w:tc>
         <w:tc>
           <w:tcPr>
-            <w:tcW w:w="4425" w:type="dxa"/>
+            <w:tcW w:w="4325" w:type="dxa"/>
             <w:tcBorders>
               <w:left w:val="single" w:sz="2" w:space="0" w:color="808080"/>
               <w:bottom w:val="single" w:sz="2" w:space="0" w:color="808080"/>
@@ -47186,7 +47200,7 @@
         </w:tc>
         <w:tc>
           <w:tcPr>
-            <w:tcW w:w="2442" w:type="dxa"/>
+            <w:tcW w:w="2486" w:type="dxa"/>
             <w:tcBorders>
               <w:left w:val="single" w:sz="2" w:space="0" w:color="808080"/>
               <w:bottom w:val="single" w:sz="2" w:space="0" w:color="808080"/>
@@ -47218,7 +47232,7 @@
         </w:tc>
         <w:tc>
           <w:tcPr>
-            <w:tcW w:w="2711" w:type="dxa"/>
+            <w:tcW w:w="2760" w:type="dxa"/>
             <w:tcBorders>
               <w:left w:val="single" w:sz="2" w:space="0" w:color="808080"/>
               <w:bottom w:val="single" w:sz="2" w:space="0" w:color="808080"/>
@@ -47294,7 +47308,7 @@
         </w:tc>
         <w:tc>
           <w:tcPr>
-            <w:tcW w:w="1007" w:type="dxa"/>
+            <w:tcW w:w="1014" w:type="dxa"/>
             <w:tcBorders>
               <w:left w:val="single" w:sz="2" w:space="0" w:color="808080"/>
               <w:bottom w:val="single" w:sz="6" w:space="0" w:color="808080"/>
@@ -47323,7 +47337,7 @@
         </w:tc>
         <w:tc>
           <w:tcPr>
-            <w:tcW w:w="4425" w:type="dxa"/>
+            <w:tcW w:w="4325" w:type="dxa"/>
             <w:tcBorders>
               <w:left w:val="single" w:sz="2" w:space="0" w:color="808080"/>
               <w:bottom w:val="single" w:sz="6" w:space="0" w:color="808080"/>
@@ -47383,7 +47397,7 @@
         </w:tc>
         <w:tc>
           <w:tcPr>
-            <w:tcW w:w="2442" w:type="dxa"/>
+            <w:tcW w:w="2486" w:type="dxa"/>
             <w:tcBorders>
               <w:left w:val="single" w:sz="2" w:space="0" w:color="808080"/>
               <w:bottom w:val="single" w:sz="6" w:space="0" w:color="808080"/>
@@ -47415,7 +47429,7 @@
         </w:tc>
         <w:tc>
           <w:tcPr>
-            <w:tcW w:w="2711" w:type="dxa"/>
+            <w:tcW w:w="2760" w:type="dxa"/>
             <w:tcBorders>
               <w:left w:val="single" w:sz="2" w:space="0" w:color="808080"/>
               <w:bottom w:val="single" w:sz="6" w:space="0" w:color="808080"/>

</xml_diff>

<commit_message>
OCS Cell: 컨테이너 플랫폼을 RKE2+Rancher(오픈소스, 0원)로 변경, Operational TSDB는 Machbase 유지
Co-Authored-By: Claude Opus 5.5 <noreply@anthropic.com>
</commit_message>
<xml_diff>
--- a/docs/ocs_precision.docx
+++ b/docs/ocs_precision.docx
@@ -1154,7 +1154,7 @@
             </w:r>
             <w:r>
               <w:rPr/>
-              <w:t>1,729,000</w:t>
+              <w:t>1,699,000</w:t>
             </w:r>
             <w:r>
               <w:rPr/>
@@ -7784,7 +7784,7 @@
             </w:pPr>
             <w:r>
               <w:rPr/>
-              <w:t>278,000</w:t>
+              <w:t>248,000</w:t>
             </w:r>
           </w:p>
         </w:tc>
@@ -8210,7 +8210,7 @@
             </w:pPr>
             <w:r>
               <w:rPr/>
-              <w:t>1,729,000</w:t>
+              <w:t>1,699,000</w:t>
             </w:r>
           </w:p>
         </w:tc>
@@ -8472,7 +8472,7 @@
             </w:pPr>
             <w:r>
               <w:rPr/>
-              <w:t>2,562,000</w:t>
+              <w:t>2,532,000</w:t>
             </w:r>
           </w:p>
         </w:tc>
@@ -9530,7 +9530,7 @@
             </w:r>
             <w:r>
               <w:rPr/>
-              <w:t xml:space="preserve">: Cocktail Cloud · Eclipse BaSyx · Machbase Cluster Edition </w:t>
+              <w:t xml:space="preserve">: RKE2 · Eclipse BaSyx · Machbase Cluster Edition </w:t>
             </w:r>
             <w:r>
               <w:rPr/>
@@ -22454,7 +22454,7 @@
       </w:r>
       <w:r>
         <w:rPr/>
-        <w:t>(Kepware·Cocktail Cloud·Machbase·DMWorks·HIWARE)</w:t>
+        <w:t>(Kepware·Machbase·DMWorks·HIWARE)</w:t>
       </w:r>
       <w:r>
         <w:rPr/>
@@ -22478,7 +22478,7 @@
       </w:r>
       <w:r>
         <w:rPr/>
-        <w:t xml:space="preserve">(Triton·RabbitMQ </w:t>
+        <w:t xml:space="preserve">(RKE2·Triton·RabbitMQ </w:t>
       </w:r>
       <w:r>
         <w:rPr/>
@@ -22539,7 +22539,7 @@
     </w:p>
     <w:tbl>
       <w:tblPr>
-        <w:tblW w:w="19041" w:type="dxa"/>
+        <w:tblW w:w="19027" w:type="dxa"/>
         <w:jc w:val="left"/>
         <w:tblInd w:w="60" w:type="dxa"/>
         <w:tblLayout w:type="fixed"/>
@@ -22563,7 +22563,7 @@
         <w:gridCol w:w="1856"/>
         <w:gridCol w:w="4304"/>
         <w:gridCol w:w="1245"/>
-        <w:gridCol w:w="1191"/>
+        <w:gridCol w:w="1177"/>
         <w:gridCol w:w="1247"/>
       </w:tblGrid>
       <w:tr>
@@ -22924,7 +22924,7 @@
         </w:tc>
         <w:tc>
           <w:tcPr>
-            <w:tcW w:w="1191" w:type="dxa"/>
+            <w:tcW w:w="1177" w:type="dxa"/>
             <w:tcBorders>
               <w:top w:val="single" w:sz="6" w:space="0" w:color="808080"/>
               <w:left w:val="single" w:sz="2" w:space="0" w:color="808080"/>
@@ -23042,7 +23042,7 @@
         </w:tc>
         <w:tc>
           <w:tcPr>
-            <w:tcW w:w="9843" w:type="dxa"/>
+            <w:tcW w:w="9829" w:type="dxa"/>
             <w:gridSpan w:val="5"/>
             <w:tcBorders>
               <w:left w:val="single" w:sz="2" w:space="0" w:color="808080"/>
@@ -23553,7 +23553,7 @@
         </w:tc>
         <w:tc>
           <w:tcPr>
-            <w:tcW w:w="1191" w:type="dxa"/>
+            <w:tcW w:w="1177" w:type="dxa"/>
             <w:tcBorders>
               <w:left w:val="single" w:sz="2" w:space="0" w:color="808080"/>
               <w:bottom w:val="single" w:sz="2" w:space="0" w:color="808080"/>
@@ -24096,7 +24096,7 @@
         </w:tc>
         <w:tc>
           <w:tcPr>
-            <w:tcW w:w="1191" w:type="dxa"/>
+            <w:tcW w:w="1177" w:type="dxa"/>
             <w:tcBorders>
               <w:left w:val="single" w:sz="2" w:space="0" w:color="808080"/>
               <w:bottom w:val="single" w:sz="2" w:space="0" w:color="808080"/>
@@ -24639,7 +24639,7 @@
         </w:tc>
         <w:tc>
           <w:tcPr>
-            <w:tcW w:w="1191" w:type="dxa"/>
+            <w:tcW w:w="1177" w:type="dxa"/>
             <w:tcBorders>
               <w:left w:val="single" w:sz="2" w:space="0" w:color="808080"/>
               <w:bottom w:val="single" w:sz="2" w:space="0" w:color="808080"/>
@@ -25148,7 +25148,7 @@
         </w:tc>
         <w:tc>
           <w:tcPr>
-            <w:tcW w:w="1191" w:type="dxa"/>
+            <w:tcW w:w="1177" w:type="dxa"/>
             <w:tcBorders>
               <w:left w:val="single" w:sz="2" w:space="0" w:color="808080"/>
               <w:bottom w:val="single" w:sz="2" w:space="0" w:color="808080"/>
@@ -25673,7 +25673,7 @@
         </w:tc>
         <w:tc>
           <w:tcPr>
-            <w:tcW w:w="1191" w:type="dxa"/>
+            <w:tcW w:w="1177" w:type="dxa"/>
             <w:tcBorders>
               <w:left w:val="single" w:sz="2" w:space="0" w:color="808080"/>
               <w:bottom w:val="single" w:sz="2" w:space="0" w:color="808080"/>
@@ -26225,7 +26225,7 @@
         </w:tc>
         <w:tc>
           <w:tcPr>
-            <w:tcW w:w="1191" w:type="dxa"/>
+            <w:tcW w:w="1177" w:type="dxa"/>
             <w:tcBorders>
               <w:left w:val="single" w:sz="2" w:space="0" w:color="808080"/>
               <w:bottom w:val="single" w:sz="2" w:space="0" w:color="808080"/>
@@ -26742,7 +26742,7 @@
         </w:tc>
         <w:tc>
           <w:tcPr>
-            <w:tcW w:w="1191" w:type="dxa"/>
+            <w:tcW w:w="1177" w:type="dxa"/>
             <w:tcBorders>
               <w:left w:val="single" w:sz="2" w:space="0" w:color="808080"/>
               <w:bottom w:val="single" w:sz="2" w:space="0" w:color="808080"/>
@@ -26870,13 +26870,13 @@
             </w:pPr>
             <w:r>
               <w:rPr/>
-              <w:t>75,000</w:t>
-            </w:r>
-          </w:p>
-        </w:tc>
-        <w:tc>
-          <w:tcPr>
-            <w:tcW w:w="9843" w:type="dxa"/>
+              <w:t>45,000</w:t>
+            </w:r>
+          </w:p>
+        </w:tc>
+        <w:tc>
+          <w:tcPr>
+            <w:tcW w:w="9829" w:type="dxa"/>
             <w:gridSpan w:val="5"/>
             <w:tcBorders>
               <w:left w:val="single" w:sz="2" w:space="0" w:color="808080"/>
@@ -27029,7 +27029,7 @@
             </w:pPr>
             <w:r>
               <w:rPr/>
-              <w:t>Cocktail Cloud (K8s HA 3</w:t>
+              <w:t>RKE2 (K8s HA 3</w:t>
             </w:r>
             <w:r>
               <w:rPr/>
@@ -27037,7 +27037,11 @@
             </w:r>
             <w:r>
               <w:rPr/>
-              <w:t>)</w:t>
+              <w:t xml:space="preserve">) + Rancher </w:t>
+            </w:r>
+            <w:r>
+              <w:rPr/>
+              <w:t>관리</w:t>
             </w:r>
           </w:p>
         </w:tc>
@@ -27061,27 +27065,23 @@
             </w:pPr>
             <w:r>
               <w:rPr/>
-              <w:t>칵테일아이오</w:t>
-            </w:r>
-            <w:r>
-              <w:rPr/>
-              <w:t>(</w:t>
-            </w:r>
-            <w:r>
-              <w:rPr/>
-              <w:t>구 아콘소프트</w:t>
-            </w:r>
-            <w:r>
-              <w:rPr/>
-              <w:t>) (</w:t>
-            </w:r>
-            <w:r>
-              <w:rPr/>
-              <w:t>한국</w:t>
-            </w:r>
-            <w:r>
-              <w:rPr/>
-              <w:t>)</w:t>
+              <w:t>SUSE (</w:t>
+            </w:r>
+            <w:r>
+              <w:rPr/>
+              <w:t>독일</w:t>
+            </w:r>
+            <w:r>
+              <w:rPr/>
+              <w:t xml:space="preserve">, </w:t>
+            </w:r>
+            <w:r>
+              <w:rPr/>
+              <w:t xml:space="preserve">오픈소스 </w:t>
+            </w:r>
+            <w:r>
+              <w:rPr/>
+              <w:t>Apache 2.0)</w:t>
             </w:r>
           </w:p>
         </w:tc>
@@ -27157,7 +27157,7 @@
             </w:pPr>
             <w:r>
               <w:rPr/>
-              <w:t>30,000</w:t>
+              <w:t>0</w:t>
             </w:r>
           </w:p>
         </w:tc>
@@ -27181,7 +27181,7 @@
             </w:pPr>
             <w:r>
               <w:rPr/>
-              <w:t>30,000</w:t>
+              <w:t>0</w:t>
             </w:r>
           </w:p>
         </w:tc>
@@ -27311,25 +27311,77 @@
         </w:tc>
         <w:tc>
           <w:tcPr>
-            <w:tcW w:w="1191" w:type="dxa"/>
-            <w:tcBorders>
-              <w:left w:val="single" w:sz="2" w:space="0" w:color="808080"/>
-              <w:bottom w:val="single" w:sz="2" w:space="0" w:color="808080"/>
-              <w:right w:val="single" w:sz="6" w:space="0" w:color="808080"/>
-            </w:tcBorders>
-            <w:vAlign w:val="center"/>
-          </w:tcPr>
-          <w:p>
-            <w:pPr>
-              <w:pStyle w:val="TableContents"/>
-              <w:bidi w:val="0"/>
-              <w:spacing w:before="0" w:after="283"/>
-              <w:jc w:val="left"/>
-              <w:rPr/>
-            </w:pPr>
-            <w:r>
-              <w:rPr/>
-              <w:t>[</w:t>
+            <w:tcW w:w="1177" w:type="dxa"/>
+            <w:tcBorders>
+              <w:left w:val="single" w:sz="2" w:space="0" w:color="808080"/>
+              <w:bottom w:val="single" w:sz="2" w:space="0" w:color="808080"/>
+              <w:right w:val="single" w:sz="6" w:space="0" w:color="808080"/>
+            </w:tcBorders>
+            <w:vAlign w:val="center"/>
+          </w:tcPr>
+          <w:p>
+            <w:pPr>
+              <w:pStyle w:val="TableContents"/>
+              <w:bidi w:val="0"/>
+              <w:spacing w:before="0" w:after="283"/>
+              <w:jc w:val="left"/>
+              <w:rPr/>
+            </w:pPr>
+            <w:r>
+              <w:rPr/>
+              <w:t>연구 인력 자체 개발</w:t>
+            </w:r>
+            <w:r>
+              <w:rPr/>
+              <w:t>(</w:t>
+            </w:r>
+            <w:r>
+              <w:rPr/>
+              <w:t>오픈소스 기반</w:t>
+            </w:r>
+            <w:r>
+              <w:rPr/>
+              <w:t xml:space="preserve">, </w:t>
+            </w:r>
+            <w:r>
+              <w:rPr/>
+              <w:t>인건비 처리</w:t>
+            </w:r>
+            <w:r>
+              <w:rPr/>
+              <w:t xml:space="preserve">). </w:t>
+            </w:r>
+            <w:r>
+              <w:rPr/>
+              <w:t xml:space="preserve">엣지 </w:t>
+            </w:r>
+            <w:r>
+              <w:rPr/>
+              <w:t>K3s·Rancher</w:t>
+            </w:r>
+            <w:r>
+              <w:rPr/>
+              <w:t>와 같은 계열로 관리 체계 통일</w:t>
+            </w:r>
+            <w:r>
+              <w:rPr/>
+              <w:t xml:space="preserve">. </w:t>
+            </w:r>
+            <w:r>
+              <w:rPr/>
+              <w:t>국산 상용</w:t>
+            </w:r>
+            <w:r>
+              <w:rPr/>
+              <w:t xml:space="preserve">(Cocktail Cloud, </w:t>
+            </w:r>
+            <w:r>
+              <w:rPr/>
+              <w:t xml:space="preserve">약 </w:t>
+            </w:r>
+            <w:r>
+              <w:rPr/>
+              <w:t>30,000 [</w:t>
             </w:r>
             <w:r>
               <w:rPr/>
@@ -27337,19 +27389,11 @@
             </w:r>
             <w:r>
               <w:rPr/>
-              <w:t xml:space="preserve">] </w:t>
-            </w:r>
-            <w:r>
-              <w:rPr/>
-              <w:t>공개가 없음</w:t>
-            </w:r>
-            <w:r>
-              <w:rPr/>
-              <w:t xml:space="preserve">. </w:t>
-            </w:r>
-            <w:r>
-              <w:rPr/>
-              <w:t>정부 표준프레임워크 지원 확인</w:t>
+              <w:t>])</w:t>
+            </w:r>
+            <w:r>
+              <w:rPr/>
+              <w:t>은 제외</w:t>
             </w:r>
           </w:p>
         </w:tc>
@@ -27376,7 +27420,19 @@
                 <w:rPr>
                   <w:rStyle w:val="Hyperlink"/>
                 </w:rPr>
-                <w:t>제품 소개 ↗</w:t>
+                <w:t>RKE2 ↗</w:t>
+              </w:r>
+            </w:hyperlink>
+            <w:r>
+              <w:rPr/>
+              <w:br/>
+            </w:r>
+            <w:hyperlink r:id="rId54" w:tgtFrame="_blank">
+              <w:r>
+                <w:rPr>
+                  <w:rStyle w:val="Hyperlink"/>
+                </w:rPr>
+                <w:t>Rancher ↗</w:t>
               </w:r>
             </w:hyperlink>
             <w:bookmarkStart w:id="30" w:name="sw-AASR"/>
@@ -27824,7 +27880,7 @@
         </w:tc>
         <w:tc>
           <w:tcPr>
-            <w:tcW w:w="1191" w:type="dxa"/>
+            <w:tcW w:w="1177" w:type="dxa"/>
             <w:tcBorders>
               <w:left w:val="single" w:sz="2" w:space="0" w:color="808080"/>
               <w:bottom w:val="single" w:sz="2" w:space="0" w:color="808080"/>
@@ -27884,7 +27940,7 @@
               <w:jc w:val="left"/>
               <w:rPr/>
             </w:pPr>
-            <w:hyperlink r:id="rId54" w:tgtFrame="_blank">
+            <w:hyperlink r:id="rId55" w:tgtFrame="_blank">
               <w:r>
                 <w:rPr>
                   <w:rStyle w:val="Hyperlink"/>
@@ -28421,7 +28477,7 @@
         </w:tc>
         <w:tc>
           <w:tcPr>
-            <w:tcW w:w="1191" w:type="dxa"/>
+            <w:tcW w:w="1177" w:type="dxa"/>
             <w:tcBorders>
               <w:left w:val="single" w:sz="2" w:space="0" w:color="808080"/>
               <w:bottom w:val="single" w:sz="2" w:space="0" w:color="808080"/>
@@ -28509,7 +28565,7 @@
               <w:jc w:val="left"/>
               <w:rPr/>
             </w:pPr>
-            <w:hyperlink r:id="rId55" w:tgtFrame="_blank">
+            <w:hyperlink r:id="rId56" w:tgtFrame="_blank">
               <w:r>
                 <w:rPr>
                   <w:rStyle w:val="Hyperlink"/>
@@ -28527,7 +28583,7 @@
               <w:rPr/>
               <w:br/>
             </w:r>
-            <w:hyperlink r:id="rId56" w:tgtFrame="_blank">
+            <w:hyperlink r:id="rId57" w:tgtFrame="_blank">
               <w:r>
                 <w:rPr>
                   <w:rStyle w:val="Hyperlink"/>
@@ -28998,7 +29054,7 @@
         </w:tc>
         <w:tc>
           <w:tcPr>
-            <w:tcW w:w="1191" w:type="dxa"/>
+            <w:tcW w:w="1177" w:type="dxa"/>
             <w:tcBorders>
               <w:left w:val="single" w:sz="2" w:space="0" w:color="808080"/>
               <w:bottom w:val="single" w:sz="2" w:space="0" w:color="808080"/>
@@ -29058,7 +29114,7 @@
               <w:jc w:val="left"/>
               <w:rPr/>
             </w:pPr>
-            <w:hyperlink r:id="rId57" w:tgtFrame="_blank">
+            <w:hyperlink r:id="rId58" w:tgtFrame="_blank">
               <w:r>
                 <w:rPr>
                   <w:rStyle w:val="Hyperlink"/>
@@ -29070,7 +29126,7 @@
               <w:rPr/>
               <w:br/>
             </w:r>
-            <w:hyperlink r:id="rId58" w:tgtFrame="_blank">
+            <w:hyperlink r:id="rId59" w:tgtFrame="_blank">
               <w:r>
                 <w:rPr>
                   <w:rStyle w:val="Hyperlink"/>
@@ -29481,7 +29537,7 @@
         </w:tc>
         <w:tc>
           <w:tcPr>
-            <w:tcW w:w="1191" w:type="dxa"/>
+            <w:tcW w:w="1177" w:type="dxa"/>
             <w:tcBorders>
               <w:left w:val="single" w:sz="2" w:space="0" w:color="808080"/>
               <w:bottom w:val="single" w:sz="2" w:space="0" w:color="808080"/>
@@ -29541,7 +29597,7 @@
               <w:jc w:val="left"/>
               <w:rPr/>
             </w:pPr>
-            <w:hyperlink r:id="rId59" w:tgtFrame="_blank">
+            <w:hyperlink r:id="rId60" w:tgtFrame="_blank">
               <w:r>
                 <w:rPr>
                   <w:rStyle w:val="Hyperlink"/>
@@ -30010,7 +30066,7 @@
         </w:tc>
         <w:tc>
           <w:tcPr>
-            <w:tcW w:w="1191" w:type="dxa"/>
+            <w:tcW w:w="1177" w:type="dxa"/>
             <w:tcBorders>
               <w:left w:val="single" w:sz="2" w:space="0" w:color="808080"/>
               <w:bottom w:val="single" w:sz="2" w:space="0" w:color="808080"/>
@@ -30106,7 +30162,7 @@
               <w:jc w:val="left"/>
               <w:rPr/>
             </w:pPr>
-            <w:hyperlink r:id="rId60" w:tgtFrame="_blank">
+            <w:hyperlink r:id="rId61" w:tgtFrame="_blank">
               <w:r>
                 <w:rPr>
                   <w:rStyle w:val="Hyperlink"/>
@@ -30118,7 +30174,7 @@
               <w:rPr/>
               <w:br/>
             </w:r>
-            <w:hyperlink r:id="rId61" w:tgtFrame="_blank">
+            <w:hyperlink r:id="rId62" w:tgtFrame="_blank">
               <w:r>
                 <w:rPr>
                   <w:rStyle w:val="Hyperlink"/>
@@ -30597,7 +30653,7 @@
         </w:tc>
         <w:tc>
           <w:tcPr>
-            <w:tcW w:w="1191" w:type="dxa"/>
+            <w:tcW w:w="1177" w:type="dxa"/>
             <w:tcBorders>
               <w:left w:val="single" w:sz="2" w:space="0" w:color="808080"/>
               <w:bottom w:val="single" w:sz="2" w:space="0" w:color="808080"/>
@@ -30657,7 +30713,7 @@
               <w:jc w:val="left"/>
               <w:rPr/>
             </w:pPr>
-            <w:hyperlink r:id="rId62" w:tgtFrame="_blank">
+            <w:hyperlink r:id="rId63" w:tgtFrame="_blank">
               <w:r>
                 <w:rPr>
                   <w:rStyle w:val="Hyperlink"/>
@@ -31164,7 +31220,7 @@
         </w:tc>
         <w:tc>
           <w:tcPr>
-            <w:tcW w:w="1191" w:type="dxa"/>
+            <w:tcW w:w="1177" w:type="dxa"/>
             <w:tcBorders>
               <w:left w:val="single" w:sz="2" w:space="0" w:color="808080"/>
               <w:bottom w:val="single" w:sz="2" w:space="0" w:color="808080"/>
@@ -31260,7 +31316,7 @@
               <w:jc w:val="left"/>
               <w:rPr/>
             </w:pPr>
-            <w:hyperlink r:id="rId63" w:tgtFrame="_blank">
+            <w:hyperlink r:id="rId64" w:tgtFrame="_blank">
               <w:r>
                 <w:rPr>
                   <w:rStyle w:val="Hyperlink"/>
@@ -31278,7 +31334,7 @@
               <w:rPr/>
               <w:br/>
             </w:r>
-            <w:hyperlink r:id="rId64" w:tgtFrame="_blank">
+            <w:hyperlink r:id="rId65" w:tgtFrame="_blank">
               <w:r>
                 <w:rPr>
                   <w:rStyle w:val="Hyperlink"/>
@@ -31737,7 +31793,7 @@
         </w:tc>
         <w:tc>
           <w:tcPr>
-            <w:tcW w:w="1191" w:type="dxa"/>
+            <w:tcW w:w="1177" w:type="dxa"/>
             <w:tcBorders>
               <w:left w:val="single" w:sz="2" w:space="0" w:color="808080"/>
               <w:bottom w:val="single" w:sz="2" w:space="0" w:color="808080"/>
@@ -31798,7 +31854,7 @@
               <w:jc w:val="left"/>
               <w:rPr/>
             </w:pPr>
-            <w:hyperlink r:id="rId65" w:tgtFrame="_blank">
+            <w:hyperlink r:id="rId66" w:tgtFrame="_blank">
               <w:r>
                 <w:rPr>
                   <w:rStyle w:val="Hyperlink"/>
@@ -31873,7 +31929,7 @@
         </w:tc>
         <w:tc>
           <w:tcPr>
-            <w:tcW w:w="9843" w:type="dxa"/>
+            <w:tcW w:w="9829" w:type="dxa"/>
             <w:gridSpan w:val="5"/>
             <w:tcBorders>
               <w:left w:val="single" w:sz="2" w:space="0" w:color="808080"/>
@@ -32386,7 +32442,7 @@
         </w:tc>
         <w:tc>
           <w:tcPr>
-            <w:tcW w:w="1191" w:type="dxa"/>
+            <w:tcW w:w="1177" w:type="dxa"/>
             <w:tcBorders>
               <w:left w:val="single" w:sz="2" w:space="0" w:color="808080"/>
               <w:bottom w:val="single" w:sz="2" w:space="0" w:color="808080"/>
@@ -32848,7 +32904,7 @@
         </w:tc>
         <w:tc>
           <w:tcPr>
-            <w:tcW w:w="1191" w:type="dxa"/>
+            <w:tcW w:w="1177" w:type="dxa"/>
             <w:tcBorders>
               <w:left w:val="single" w:sz="2" w:space="0" w:color="808080"/>
               <w:bottom w:val="single" w:sz="2" w:space="0" w:color="808080"/>
@@ -33330,7 +33386,7 @@
         </w:tc>
         <w:tc>
           <w:tcPr>
-            <w:tcW w:w="1191" w:type="dxa"/>
+            <w:tcW w:w="1177" w:type="dxa"/>
             <w:tcBorders>
               <w:left w:val="single" w:sz="2" w:space="0" w:color="808080"/>
               <w:bottom w:val="single" w:sz="2" w:space="0" w:color="808080"/>
@@ -33370,7 +33426,7 @@
               <w:jc w:val="left"/>
               <w:rPr/>
             </w:pPr>
-            <w:hyperlink r:id="rId66" w:tgtFrame="_blank">
+            <w:hyperlink r:id="rId67" w:tgtFrame="_blank">
               <w:r>
                 <w:rPr>
                   <w:rStyle w:val="Hyperlink"/>
@@ -33799,7 +33855,7 @@
         </w:tc>
         <w:tc>
           <w:tcPr>
-            <w:tcW w:w="1191" w:type="dxa"/>
+            <w:tcW w:w="1177" w:type="dxa"/>
             <w:tcBorders>
               <w:left w:val="single" w:sz="2" w:space="0" w:color="808080"/>
               <w:bottom w:val="single" w:sz="2" w:space="0" w:color="808080"/>
@@ -33860,7 +33916,7 @@
               <w:jc w:val="left"/>
               <w:rPr/>
             </w:pPr>
-            <w:hyperlink r:id="rId67" w:tgtFrame="_blank">
+            <w:hyperlink r:id="rId68" w:tgtFrame="_blank">
               <w:r>
                 <w:rPr>
                   <w:rStyle w:val="Hyperlink"/>
@@ -33872,7 +33928,7 @@
               <w:rPr/>
               <w:br/>
             </w:r>
-            <w:hyperlink r:id="rId68" w:tgtFrame="_blank">
+            <w:hyperlink r:id="rId69" w:tgtFrame="_blank">
               <w:r>
                 <w:rPr>
                   <w:rStyle w:val="Hyperlink"/>
@@ -33959,7 +34015,7 @@
         </w:tc>
         <w:tc>
           <w:tcPr>
-            <w:tcW w:w="9843" w:type="dxa"/>
+            <w:tcW w:w="9829" w:type="dxa"/>
             <w:gridSpan w:val="5"/>
             <w:tcBorders>
               <w:left w:val="single" w:sz="2" w:space="0" w:color="808080"/>
@@ -34422,7 +34478,7 @@
         </w:tc>
         <w:tc>
           <w:tcPr>
-            <w:tcW w:w="1191" w:type="dxa"/>
+            <w:tcW w:w="1177" w:type="dxa"/>
             <w:tcBorders>
               <w:left w:val="single" w:sz="2" w:space="0" w:color="808080"/>
               <w:bottom w:val="single" w:sz="2" w:space="0" w:color="808080"/>
@@ -34474,7 +34530,7 @@
               <w:jc w:val="left"/>
               <w:rPr/>
             </w:pPr>
-            <w:hyperlink r:id="rId69" w:tgtFrame="_blank">
+            <w:hyperlink r:id="rId70" w:tgtFrame="_blank">
               <w:r>
                 <w:rPr>
                   <w:rStyle w:val="Hyperlink"/>
@@ -34486,7 +34542,7 @@
               <w:rPr/>
               <w:br/>
             </w:r>
-            <w:hyperlink r:id="rId70" w:tgtFrame="_blank">
+            <w:hyperlink r:id="rId71" w:tgtFrame="_blank">
               <w:r>
                 <w:rPr>
                   <w:rStyle w:val="Hyperlink"/>
@@ -34925,7 +34981,7 @@
         </w:tc>
         <w:tc>
           <w:tcPr>
-            <w:tcW w:w="1191" w:type="dxa"/>
+            <w:tcW w:w="1177" w:type="dxa"/>
             <w:tcBorders>
               <w:left w:val="single" w:sz="2" w:space="0" w:color="808080"/>
               <w:bottom w:val="single" w:sz="2" w:space="0" w:color="808080"/>
@@ -35047,7 +35103,7 @@
             </w:pPr>
             <w:r>
               <w:rPr/>
-              <w:t xml:space="preserve">278,000 </w:t>
+              <w:t xml:space="preserve">248,000 </w:t>
             </w:r>
             <w:r>
               <w:rPr/>
@@ -35057,7 +35113,7 @@
         </w:tc>
         <w:tc>
           <w:tcPr>
-            <w:tcW w:w="7987" w:type="dxa"/>
+            <w:tcW w:w="7973" w:type="dxa"/>
             <w:gridSpan w:val="4"/>
             <w:tcBorders>
               <w:left w:val="single" w:sz="2" w:space="0" w:color="808080"/>
@@ -36361,7 +36417,7 @@
               <w:jc w:val="left"/>
               <w:rPr/>
             </w:pPr>
-            <w:hyperlink r:id="rId71" w:tgtFrame="_blank">
+            <w:hyperlink r:id="rId72" w:tgtFrame="_blank">
               <w:r>
                 <w:rPr>
                   <w:rStyle w:val="Hyperlink"/>
@@ -36379,7 +36435,7 @@
               <w:rPr/>
               <w:br/>
             </w:r>
-            <w:hyperlink r:id="rId72" w:tgtFrame="_blank">
+            <w:hyperlink r:id="rId73" w:tgtFrame="_blank">
               <w:r>
                 <w:rPr>
                   <w:rStyle w:val="Hyperlink"/>
@@ -36409,7 +36465,7 @@
               <w:rPr/>
               <w:br/>
             </w:r>
-            <w:hyperlink r:id="rId73" w:tgtFrame="_blank">
+            <w:hyperlink r:id="rId74" w:tgtFrame="_blank">
               <w:r>
                 <w:rPr>
                   <w:rStyle w:val="Hyperlink"/>
@@ -36907,7 +36963,7 @@
               <w:jc w:val="left"/>
               <w:rPr/>
             </w:pPr>
-            <w:hyperlink r:id="rId74" w:tgtFrame="_blank">
+            <w:hyperlink r:id="rId75" w:tgtFrame="_blank">
               <w:r>
                 <w:rPr>
                   <w:rStyle w:val="Hyperlink"/>
@@ -36925,7 +36981,7 @@
               <w:rPr/>
               <w:br/>
             </w:r>
-            <w:hyperlink r:id="rId75" w:tgtFrame="_blank">
+            <w:hyperlink r:id="rId76" w:tgtFrame="_blank">
               <w:r>
                 <w:rPr>
                   <w:rStyle w:val="Hyperlink"/>
@@ -36943,7 +36999,7 @@
               <w:rPr/>
               <w:br/>
             </w:r>
-            <w:hyperlink r:id="rId76" w:tgtFrame="_blank">
+            <w:hyperlink r:id="rId77" w:tgtFrame="_blank">
               <w:r>
                 <w:rPr>
                   <w:rStyle w:val="Hyperlink"/>
@@ -38467,7 +38523,7 @@
               <w:jc w:val="left"/>
               <w:rPr/>
             </w:pPr>
-            <w:hyperlink r:id="rId77" w:tgtFrame="_blank">
+            <w:hyperlink r:id="rId78" w:tgtFrame="_blank">
               <w:r>
                 <w:rPr>
                   <w:rStyle w:val="Hyperlink"/>
@@ -38503,7 +38559,7 @@
               <w:rPr/>
               <w:br/>
             </w:r>
-            <w:hyperlink r:id="rId78" w:tgtFrame="_blank">
+            <w:hyperlink r:id="rId79" w:tgtFrame="_blank">
               <w:r>
                 <w:rPr>
                   <w:rStyle w:val="Hyperlink"/>
@@ -39458,7 +39514,7 @@
               <w:jc w:val="left"/>
               <w:rPr/>
             </w:pPr>
-            <w:hyperlink r:id="rId79" w:tgtFrame="_blank">
+            <w:hyperlink r:id="rId80" w:tgtFrame="_blank">
               <w:r>
                 <w:rPr>
                   <w:rStyle w:val="Hyperlink"/>
@@ -40579,7 +40635,7 @@
               <w:jc w:val="left"/>
               <w:rPr/>
             </w:pPr>
-            <w:hyperlink r:id="rId80" w:tgtFrame="_blank">
+            <w:hyperlink r:id="rId81" w:tgtFrame="_blank">
               <w:r>
                 <w:rPr>
                   <w:rStyle w:val="Hyperlink"/>
@@ -40969,7 +41025,7 @@
               <w:jc w:val="left"/>
               <w:rPr/>
             </w:pPr>
-            <w:hyperlink r:id="rId81" w:tgtFrame="_blank">
+            <w:hyperlink r:id="rId82" w:tgtFrame="_blank">
               <w:r>
                 <w:rPr>
                   <w:rStyle w:val="Hyperlink"/>
@@ -40981,7 +41037,7 @@
               <w:rPr/>
               <w:br/>
             </w:r>
-            <w:hyperlink r:id="rId82" w:tgtFrame="_blank">
+            <w:hyperlink r:id="rId83" w:tgtFrame="_blank">
               <w:r>
                 <w:rPr>
                   <w:rStyle w:val="Hyperlink"/>
@@ -41959,7 +42015,7 @@
               <w:jc w:val="left"/>
               <w:rPr/>
             </w:pPr>
-            <w:hyperlink r:id="rId83" w:tgtFrame="_blank">
+            <w:hyperlink r:id="rId84" w:tgtFrame="_blank">
               <w:r>
                 <w:rPr>
                   <w:rStyle w:val="Hyperlink"/>
@@ -42940,7 +42996,7 @@
               <w:jc w:val="left"/>
               <w:rPr/>
             </w:pPr>
-            <w:hyperlink r:id="rId84" w:tgtFrame="_blank">
+            <w:hyperlink r:id="rId85" w:tgtFrame="_blank">
               <w:r>
                 <w:rPr>
                   <w:rStyle w:val="Hyperlink"/>
@@ -43825,7 +43881,7 @@
               <w:jc w:val="left"/>
               <w:rPr/>
             </w:pPr>
-            <w:hyperlink r:id="rId85" w:tgtFrame="_blank">
+            <w:hyperlink r:id="rId86" w:tgtFrame="_blank">
               <w:r>
                 <w:rPr>
                   <w:rStyle w:val="Hyperlink"/>
@@ -44203,7 +44259,7 @@
               <w:jc w:val="left"/>
               <w:rPr/>
             </w:pPr>
-            <w:hyperlink r:id="rId86" w:tgtFrame="_blank">
+            <w:hyperlink r:id="rId87" w:tgtFrame="_blank">
               <w:r>
                 <w:rPr>
                   <w:rStyle w:val="Hyperlink"/>
@@ -45109,7 +45165,7 @@
               <w:jc w:val="left"/>
               <w:rPr/>
             </w:pPr>
-            <w:hyperlink r:id="rId87" w:tgtFrame="_blank">
+            <w:hyperlink r:id="rId88" w:tgtFrame="_blank">
               <w:r>
                 <w:rPr>
                   <w:rStyle w:val="Hyperlink"/>

</xml_diff>

<commit_message>
OCS Cell: OPC UA Aggregation을 open62541+PLC4X(오픈소스, 0원)로 변경, 장비 통신 방식 쟁점 추가, 보안 스택 유지
Co-Authored-By: Claude Opus 5.5 <noreply@anthropic.com>
</commit_message>
<xml_diff>
--- a/docs/ocs_precision.docx
+++ b/docs/ocs_precision.docx
@@ -1154,7 +1154,7 @@
             </w:r>
             <w:r>
               <w:rPr/>
-              <w:t>1,699,000</w:t>
+              <w:t>1,624,000</w:t>
             </w:r>
             <w:r>
               <w:rPr/>
@@ -7784,7 +7784,7 @@
             </w:pPr>
             <w:r>
               <w:rPr/>
-              <w:t>248,000</w:t>
+              <w:t>173,000</w:t>
             </w:r>
           </w:p>
         </w:tc>
@@ -8210,7 +8210,7 @@
             </w:pPr>
             <w:r>
               <w:rPr/>
-              <w:t>1,699,000</w:t>
+              <w:t>1,624,000</w:t>
             </w:r>
           </w:p>
         </w:tc>
@@ -8472,7 +8472,7 @@
             </w:pPr>
             <w:r>
               <w:rPr/>
-              <w:t>2,532,000</w:t>
+              <w:t>2,457,000</w:t>
             </w:r>
           </w:p>
         </w:tc>
@@ -8920,7 +8920,7 @@
     </w:p>
     <w:tbl>
       <w:tblPr>
-        <w:tblW w:w="14575" w:type="dxa"/>
+        <w:tblW w:w="14611" w:type="dxa"/>
         <w:jc w:val="left"/>
         <w:tblInd w:w="60" w:type="dxa"/>
         <w:tblLayout w:type="fixed"/>
@@ -8933,7 +8933,7 @@
       </w:tblPr>
       <w:tblGrid>
         <w:gridCol w:w="741"/>
-        <w:gridCol w:w="1443"/>
+        <w:gridCol w:w="1479"/>
         <w:gridCol w:w="1191"/>
         <w:gridCol w:w="1488"/>
         <w:gridCol w:w="984"/>
@@ -8980,7 +8980,7 @@
         </w:tc>
         <w:tc>
           <w:tcPr>
-            <w:tcW w:w="1443" w:type="dxa"/>
+            <w:tcW w:w="1479" w:type="dxa"/>
             <w:tcBorders>
               <w:top w:val="single" w:sz="6" w:space="0" w:color="808080"/>
               <w:left w:val="single" w:sz="2" w:space="0" w:color="808080"/>
@@ -9361,7 +9361,7 @@
         <w:trPr/>
         <w:tc>
           <w:tcPr>
-            <w:tcW w:w="7466" w:type="dxa"/>
+            <w:tcW w:w="7502" w:type="dxa"/>
             <w:gridSpan w:val="8"/>
             <w:tcBorders>
               <w:left w:val="single" w:sz="6" w:space="0" w:color="808080"/>
@@ -9474,7 +9474,7 @@
         </w:tc>
         <w:tc>
           <w:tcPr>
-            <w:tcW w:w="1443" w:type="dxa"/>
+            <w:tcW w:w="1479" w:type="dxa"/>
             <w:tcBorders>
               <w:left w:val="single" w:sz="2" w:space="0" w:color="808080"/>
               <w:bottom w:val="single" w:sz="2" w:space="0" w:color="808080"/>
@@ -10079,7 +10079,7 @@
         </w:tc>
         <w:tc>
           <w:tcPr>
-            <w:tcW w:w="1443" w:type="dxa"/>
+            <w:tcW w:w="1479" w:type="dxa"/>
             <w:tcBorders>
               <w:left w:val="single" w:sz="2" w:space="0" w:color="808080"/>
               <w:bottom w:val="single" w:sz="2" w:space="0" w:color="808080"/>
@@ -10794,7 +10794,7 @@
         </w:tc>
         <w:tc>
           <w:tcPr>
-            <w:tcW w:w="1443" w:type="dxa"/>
+            <w:tcW w:w="1479" w:type="dxa"/>
             <w:tcBorders>
               <w:left w:val="single" w:sz="2" w:space="0" w:color="808080"/>
               <w:bottom w:val="single" w:sz="2" w:space="0" w:color="808080"/>
@@ -11427,7 +11427,7 @@
         </w:tc>
         <w:tc>
           <w:tcPr>
-            <w:tcW w:w="1443" w:type="dxa"/>
+            <w:tcW w:w="1479" w:type="dxa"/>
             <w:tcBorders>
               <w:left w:val="single" w:sz="2" w:space="0" w:color="808080"/>
               <w:bottom w:val="single" w:sz="2" w:space="0" w:color="808080"/>
@@ -11899,7 +11899,7 @@
         <w:trPr/>
         <w:tc>
           <w:tcPr>
-            <w:tcW w:w="7466" w:type="dxa"/>
+            <w:tcW w:w="7502" w:type="dxa"/>
             <w:gridSpan w:val="8"/>
             <w:tcBorders>
               <w:left w:val="single" w:sz="6" w:space="0" w:color="808080"/>
@@ -12012,7 +12012,7 @@
         </w:tc>
         <w:tc>
           <w:tcPr>
-            <w:tcW w:w="1443" w:type="dxa"/>
+            <w:tcW w:w="1479" w:type="dxa"/>
             <w:tcBorders>
               <w:left w:val="single" w:sz="2" w:space="0" w:color="808080"/>
               <w:bottom w:val="single" w:sz="2" w:space="0" w:color="808080"/>
@@ -12050,7 +12050,23 @@
             </w:r>
             <w:r>
               <w:rPr/>
-              <w:t xml:space="preserve">: KEPServerEX · AAS </w:t>
+              <w:t xml:space="preserve">: open62541 OPC UA </w:t>
+            </w:r>
+            <w:r>
+              <w:rPr/>
+              <w:t xml:space="preserve">서버 </w:t>
+            </w:r>
+            <w:r>
+              <w:rPr/>
+              <w:t xml:space="preserve">+ Apache PLC4X </w:t>
+            </w:r>
+            <w:r>
+              <w:rPr/>
+              <w:t xml:space="preserve">장비 드라이버 </w:t>
+            </w:r>
+            <w:r>
+              <w:rPr/>
+              <w:t xml:space="preserve">· AAS </w:t>
             </w:r>
             <w:r>
               <w:rPr/>
@@ -12066,15 +12082,15 @@
             </w:r>
             <w:r>
               <w:rPr/>
-              <w:t xml:space="preserve">· Kepware </w:t>
-            </w:r>
-            <w:r>
-              <w:rPr/>
-              <w:t xml:space="preserve">드라이버 </w:t>
-            </w:r>
-            <w:r>
-              <w:rPr/>
-              <w:t xml:space="preserve">+ </w:t>
+              <w:t xml:space="preserve">· PLC4X </w:t>
+            </w:r>
+            <w:r>
+              <w:rPr/>
+              <w:t>드라이버</w:t>
+            </w:r>
+            <w:r>
+              <w:rPr/>
+              <w:t xml:space="preserve">(S7·Modbus·EtherNet/IP·ADS) + </w:t>
             </w:r>
             <w:r>
               <w:rPr/>
@@ -12755,7 +12771,7 @@
         </w:tc>
         <w:tc>
           <w:tcPr>
-            <w:tcW w:w="1443" w:type="dxa"/>
+            <w:tcW w:w="1479" w:type="dxa"/>
             <w:tcBorders>
               <w:left w:val="single" w:sz="2" w:space="0" w:color="808080"/>
               <w:bottom w:val="single" w:sz="2" w:space="0" w:color="808080"/>
@@ -13550,7 +13566,7 @@
         </w:tc>
         <w:tc>
           <w:tcPr>
-            <w:tcW w:w="1443" w:type="dxa"/>
+            <w:tcW w:w="1479" w:type="dxa"/>
             <w:tcBorders>
               <w:left w:val="single" w:sz="2" w:space="0" w:color="808080"/>
               <w:bottom w:val="single" w:sz="2" w:space="0" w:color="808080"/>
@@ -14047,7 +14063,7 @@
         <w:trPr/>
         <w:tc>
           <w:tcPr>
-            <w:tcW w:w="7466" w:type="dxa"/>
+            <w:tcW w:w="7502" w:type="dxa"/>
             <w:gridSpan w:val="8"/>
             <w:tcBorders>
               <w:left w:val="single" w:sz="6" w:space="0" w:color="808080"/>
@@ -14172,7 +14188,7 @@
         </w:tc>
         <w:tc>
           <w:tcPr>
-            <w:tcW w:w="1443" w:type="dxa"/>
+            <w:tcW w:w="1479" w:type="dxa"/>
             <w:tcBorders>
               <w:left w:val="single" w:sz="2" w:space="0" w:color="808080"/>
               <w:bottom w:val="single" w:sz="2" w:space="0" w:color="808080"/>
@@ -14819,7 +14835,7 @@
         </w:tc>
         <w:tc>
           <w:tcPr>
-            <w:tcW w:w="1443" w:type="dxa"/>
+            <w:tcW w:w="1479" w:type="dxa"/>
             <w:tcBorders>
               <w:left w:val="single" w:sz="2" w:space="0" w:color="808080"/>
               <w:bottom w:val="single" w:sz="2" w:space="0" w:color="808080"/>
@@ -15388,7 +15404,7 @@
         </w:tc>
         <w:tc>
           <w:tcPr>
-            <w:tcW w:w="1443" w:type="dxa"/>
+            <w:tcW w:w="1479" w:type="dxa"/>
             <w:tcBorders>
               <w:left w:val="single" w:sz="2" w:space="0" w:color="808080"/>
               <w:bottom w:val="single" w:sz="2" w:space="0" w:color="808080"/>
@@ -16081,7 +16097,7 @@
         </w:tc>
         <w:tc>
           <w:tcPr>
-            <w:tcW w:w="1443" w:type="dxa"/>
+            <w:tcW w:w="1479" w:type="dxa"/>
             <w:tcBorders>
               <w:left w:val="single" w:sz="2" w:space="0" w:color="808080"/>
               <w:bottom w:val="single" w:sz="2" w:space="0" w:color="808080"/>
@@ -16538,7 +16554,7 @@
         </w:tc>
         <w:tc>
           <w:tcPr>
-            <w:tcW w:w="1443" w:type="dxa"/>
+            <w:tcW w:w="1479" w:type="dxa"/>
             <w:tcBorders>
               <w:left w:val="single" w:sz="2" w:space="0" w:color="808080"/>
               <w:bottom w:val="single" w:sz="2" w:space="0" w:color="808080"/>
@@ -17033,7 +17049,7 @@
         </w:tc>
         <w:tc>
           <w:tcPr>
-            <w:tcW w:w="1443" w:type="dxa"/>
+            <w:tcW w:w="1479" w:type="dxa"/>
             <w:tcBorders>
               <w:left w:val="single" w:sz="2" w:space="0" w:color="808080"/>
               <w:bottom w:val="single" w:sz="2" w:space="0" w:color="808080"/>
@@ -17536,7 +17552,7 @@
         </w:tc>
         <w:tc>
           <w:tcPr>
-            <w:tcW w:w="1443" w:type="dxa"/>
+            <w:tcW w:w="1479" w:type="dxa"/>
             <w:tcBorders>
               <w:left w:val="single" w:sz="2" w:space="0" w:color="808080"/>
               <w:bottom w:val="single" w:sz="2" w:space="0" w:color="808080"/>
@@ -18089,7 +18105,7 @@
         </w:tc>
         <w:tc>
           <w:tcPr>
-            <w:tcW w:w="1443" w:type="dxa"/>
+            <w:tcW w:w="1479" w:type="dxa"/>
             <w:tcBorders>
               <w:left w:val="single" w:sz="2" w:space="0" w:color="808080"/>
               <w:bottom w:val="single" w:sz="2" w:space="0" w:color="808080"/>
@@ -18546,7 +18562,7 @@
         <w:trPr/>
         <w:tc>
           <w:tcPr>
-            <w:tcW w:w="7466" w:type="dxa"/>
+            <w:tcW w:w="7502" w:type="dxa"/>
             <w:gridSpan w:val="8"/>
             <w:tcBorders>
               <w:left w:val="single" w:sz="6" w:space="0" w:color="808080"/>
@@ -18665,7 +18681,7 @@
         </w:tc>
         <w:tc>
           <w:tcPr>
-            <w:tcW w:w="1443" w:type="dxa"/>
+            <w:tcW w:w="1479" w:type="dxa"/>
             <w:tcBorders>
               <w:left w:val="single" w:sz="2" w:space="0" w:color="808080"/>
               <w:bottom w:val="single" w:sz="2" w:space="0" w:color="808080"/>
@@ -19220,7 +19236,7 @@
         </w:tc>
         <w:tc>
           <w:tcPr>
-            <w:tcW w:w="1443" w:type="dxa"/>
+            <w:tcW w:w="1479" w:type="dxa"/>
             <w:tcBorders>
               <w:left w:val="single" w:sz="2" w:space="0" w:color="808080"/>
               <w:bottom w:val="single" w:sz="2" w:space="0" w:color="808080"/>
@@ -19767,7 +19783,7 @@
         </w:tc>
         <w:tc>
           <w:tcPr>
-            <w:tcW w:w="1443" w:type="dxa"/>
+            <w:tcW w:w="1479" w:type="dxa"/>
             <w:tcBorders>
               <w:left w:val="single" w:sz="2" w:space="0" w:color="808080"/>
               <w:bottom w:val="single" w:sz="2" w:space="0" w:color="808080"/>
@@ -20223,7 +20239,7 @@
         <w:trPr/>
         <w:tc>
           <w:tcPr>
-            <w:tcW w:w="7466" w:type="dxa"/>
+            <w:tcW w:w="7502" w:type="dxa"/>
             <w:gridSpan w:val="8"/>
             <w:tcBorders>
               <w:left w:val="single" w:sz="6" w:space="0" w:color="808080"/>
@@ -20336,7 +20352,7 @@
         </w:tc>
         <w:tc>
           <w:tcPr>
-            <w:tcW w:w="1443" w:type="dxa"/>
+            <w:tcW w:w="1479" w:type="dxa"/>
             <w:tcBorders>
               <w:left w:val="single" w:sz="2" w:space="0" w:color="808080"/>
               <w:bottom w:val="single" w:sz="2" w:space="0" w:color="808080"/>
@@ -20842,7 +20858,7 @@
         </w:tc>
         <w:tc>
           <w:tcPr>
-            <w:tcW w:w="1443" w:type="dxa"/>
+            <w:tcW w:w="1479" w:type="dxa"/>
             <w:tcBorders>
               <w:left w:val="single" w:sz="2" w:space="0" w:color="808080"/>
               <w:bottom w:val="single" w:sz="2" w:space="0" w:color="808080"/>
@@ -21395,7 +21411,7 @@
         </w:tc>
         <w:tc>
           <w:tcPr>
-            <w:tcW w:w="1443" w:type="dxa"/>
+            <w:tcW w:w="1479" w:type="dxa"/>
             <w:tcBorders>
               <w:left w:val="single" w:sz="2" w:space="0" w:color="808080"/>
               <w:bottom w:val="single" w:sz="2" w:space="0" w:color="808080"/>
@@ -21868,7 +21884,7 @@
         </w:tc>
         <w:tc>
           <w:tcPr>
-            <w:tcW w:w="1443" w:type="dxa"/>
+            <w:tcW w:w="1479" w:type="dxa"/>
             <w:tcBorders>
               <w:left w:val="single" w:sz="2" w:space="0" w:color="808080"/>
               <w:bottom w:val="single" w:sz="2" w:space="0" w:color="808080"/>
@@ -22283,7 +22299,7 @@
         <w:trPr/>
         <w:tc>
           <w:tcPr>
-            <w:tcW w:w="7466" w:type="dxa"/>
+            <w:tcW w:w="7502" w:type="dxa"/>
             <w:gridSpan w:val="8"/>
             <w:tcBorders>
               <w:left w:val="single" w:sz="6" w:space="0" w:color="808080"/>
@@ -22454,7 +22470,7 @@
       </w:r>
       <w:r>
         <w:rPr/>
-        <w:t>(Kepware·Machbase·DMWorks·HIWARE)</w:t>
+        <w:t>(Machbase·DMWorks·HIWARE)</w:t>
       </w:r>
       <w:r>
         <w:rPr/>
@@ -22478,7 +22494,7 @@
       </w:r>
       <w:r>
         <w:rPr/>
-        <w:t xml:space="preserve">(RKE2·Triton·RabbitMQ </w:t>
+        <w:t xml:space="preserve">(open62541·PLC4X·RKE2·Triton·RabbitMQ </w:t>
       </w:r>
       <w:r>
         <w:rPr/>
@@ -22539,7 +22555,7 @@
     </w:p>
     <w:tbl>
       <w:tblPr>
-        <w:tblW w:w="19027" w:type="dxa"/>
+        <w:tblW w:w="18953" w:type="dxa"/>
         <w:jc w:val="left"/>
         <w:tblInd w:w="60" w:type="dxa"/>
         <w:tblLayout w:type="fixed"/>
@@ -22563,7 +22579,7 @@
         <w:gridCol w:w="1856"/>
         <w:gridCol w:w="4304"/>
         <w:gridCol w:w="1245"/>
-        <w:gridCol w:w="1177"/>
+        <w:gridCol w:w="1103"/>
         <w:gridCol w:w="1247"/>
       </w:tblGrid>
       <w:tr>
@@ -22924,7 +22940,7 @@
         </w:tc>
         <w:tc>
           <w:tcPr>
-            <w:tcW w:w="1177" w:type="dxa"/>
+            <w:tcW w:w="1103" w:type="dxa"/>
             <w:tcBorders>
               <w:top w:val="single" w:sz="6" w:space="0" w:color="808080"/>
               <w:left w:val="single" w:sz="2" w:space="0" w:color="808080"/>
@@ -23036,13 +23052,13 @@
             </w:pPr>
             <w:r>
               <w:rPr/>
-              <w:t>75,000</w:t>
-            </w:r>
-          </w:p>
-        </w:tc>
-        <w:tc>
-          <w:tcPr>
-            <w:tcW w:w="9829" w:type="dxa"/>
+              <w:t>0</w:t>
+            </w:r>
+          </w:p>
+        </w:tc>
+        <w:tc>
+          <w:tcPr>
+            <w:tcW w:w="9755" w:type="dxa"/>
             <w:gridSpan w:val="5"/>
             <w:tcBorders>
               <w:left w:val="single" w:sz="2" w:space="0" w:color="808080"/>
@@ -23199,7 +23215,31 @@
             </w:pPr>
             <w:r>
               <w:rPr/>
-              <w:t>KEPServerEX (OPC UA Server · IoT Gateway)</w:t>
+              <w:t xml:space="preserve">open62541 OPC UA </w:t>
+            </w:r>
+            <w:r>
+              <w:rPr/>
+              <w:t xml:space="preserve">서버 </w:t>
+            </w:r>
+            <w:r>
+              <w:rPr/>
+              <w:t xml:space="preserve">+ Apache PLC4X </w:t>
+            </w:r>
+            <w:r>
+              <w:rPr/>
+              <w:t xml:space="preserve">장비 드라이버 </w:t>
+            </w:r>
+            <w:r>
+              <w:rPr/>
+              <w:t xml:space="preserve">(Aggregation </w:t>
+            </w:r>
+            <w:r>
+              <w:rPr/>
+              <w:t>자체 구성</w:t>
+            </w:r>
+            <w:r>
+              <w:rPr/>
+              <w:t>)</w:t>
             </w:r>
           </w:p>
         </w:tc>
@@ -23223,15 +23263,15 @@
             </w:pPr>
             <w:r>
               <w:rPr/>
-              <w:t>PTC Kepware (</w:t>
-            </w:r>
-            <w:r>
-              <w:rPr/>
-              <w:t>미국</w:t>
-            </w:r>
-            <w:r>
-              <w:rPr/>
-              <w:t>)</w:t>
+              <w:t xml:space="preserve">오픈소스 </w:t>
+            </w:r>
+            <w:r>
+              <w:rPr/>
+              <w:t xml:space="preserve">(MPL 2.0 · Apache 2.0) + </w:t>
+            </w:r>
+            <w:r>
+              <w:rPr/>
+              <w:t>자체 개발</w:t>
             </w:r>
           </w:p>
         </w:tc>
@@ -23307,7 +23347,7 @@
             </w:pPr>
             <w:r>
               <w:rPr/>
-              <w:t>15,000</w:t>
+              <w:t>0</w:t>
             </w:r>
           </w:p>
         </w:tc>
@@ -23331,7 +23371,7 @@
             </w:pPr>
             <w:r>
               <w:rPr/>
-              <w:t>75,000</w:t>
+              <w:t>0</w:t>
             </w:r>
           </w:p>
         </w:tc>
@@ -23527,7 +23567,7 @@
             </w:r>
             <w:r>
               <w:rPr/>
-              <w:t>카피씩</w:t>
+              <w:t xml:space="preserve">식씩 배포 </w:t>
             </w:r>
             <w:r>
               <w:rPr/>
@@ -23535,15 +23575,7 @@
             </w:r>
             <w:r>
               <w:rPr/>
-              <w:t xml:space="preserve">예비 </w:t>
-            </w:r>
-            <w:r>
-              <w:rPr/>
-              <w:t>EGW</w:t>
-            </w:r>
-            <w:r>
-              <w:rPr/>
-              <w:t>는 고장 시 라이선스 이전</w:t>
+              <w:t>오픈소스라 라이선스 수량 제한 없음</w:t>
             </w:r>
             <w:r>
               <w:rPr/>
@@ -23553,25 +23585,53 @@
         </w:tc>
         <w:tc>
           <w:tcPr>
-            <w:tcW w:w="1177" w:type="dxa"/>
-            <w:tcBorders>
-              <w:left w:val="single" w:sz="2" w:space="0" w:color="808080"/>
-              <w:bottom w:val="single" w:sz="2" w:space="0" w:color="808080"/>
-              <w:right w:val="single" w:sz="6" w:space="0" w:color="808080"/>
-            </w:tcBorders>
-            <w:vAlign w:val="center"/>
-          </w:tcPr>
-          <w:p>
-            <w:pPr>
-              <w:pStyle w:val="TableContents"/>
-              <w:bidi w:val="0"/>
-              <w:spacing w:before="0" w:after="283"/>
-              <w:jc w:val="left"/>
-              <w:rPr/>
-            </w:pPr>
-            <w:r>
-              <w:rPr/>
-              <w:t>[</w:t>
+            <w:tcW w:w="1103" w:type="dxa"/>
+            <w:tcBorders>
+              <w:left w:val="single" w:sz="2" w:space="0" w:color="808080"/>
+              <w:bottom w:val="single" w:sz="2" w:space="0" w:color="808080"/>
+              <w:right w:val="single" w:sz="6" w:space="0" w:color="808080"/>
+            </w:tcBorders>
+            <w:vAlign w:val="center"/>
+          </w:tcPr>
+          <w:p>
+            <w:pPr>
+              <w:pStyle w:val="TableContents"/>
+              <w:bidi w:val="0"/>
+              <w:spacing w:before="0" w:after="283"/>
+              <w:jc w:val="left"/>
+              <w:rPr/>
+            </w:pPr>
+            <w:r>
+              <w:rPr/>
+              <w:t>연구 인력 자체 개발</w:t>
+            </w:r>
+            <w:r>
+              <w:rPr/>
+              <w:t>(</w:t>
+            </w:r>
+            <w:r>
+              <w:rPr/>
+              <w:t>오픈소스 기반</w:t>
+            </w:r>
+            <w:r>
+              <w:rPr/>
+              <w:t xml:space="preserve">, </w:t>
+            </w:r>
+            <w:r>
+              <w:rPr/>
+              <w:t>인건비 처리</w:t>
+            </w:r>
+            <w:r>
+              <w:rPr/>
+              <w:t>). Kepware(5</w:t>
+            </w:r>
+            <w:r>
+              <w:rPr/>
+              <w:t xml:space="preserve">카피 약 </w:t>
+            </w:r>
+            <w:r>
+              <w:rPr/>
+              <w:t>75,000 [</w:t>
             </w:r>
             <w:r>
               <w:rPr/>
@@ -23579,11 +23639,27 @@
             </w:r>
             <w:r>
               <w:rPr/>
-              <w:t xml:space="preserve">] </w:t>
-            </w:r>
-            <w:r>
-              <w:rPr/>
-              <w:t>드라이버 조합별 견적</w:t>
+              <w:t>])</w:t>
+            </w:r>
+            <w:r>
+              <w:rPr/>
+              <w:t>는 제외</w:t>
+            </w:r>
+            <w:r>
+              <w:rPr/>
+              <w:t xml:space="preserve">. </w:t>
+            </w:r>
+            <w:r>
+              <w:rPr/>
+              <w:t xml:space="preserve">고유 프로토콜 장비가 확인되면 해당 셀만 </w:t>
+            </w:r>
+            <w:r>
+              <w:rPr/>
+              <w:t>Kepware 1~2</w:t>
+            </w:r>
+            <w:r>
+              <w:rPr/>
+              <w:t>카피로 보완</w:t>
             </w:r>
           </w:p>
         </w:tc>
@@ -23610,7 +23686,19 @@
                 <w:rPr>
                   <w:rStyle w:val="Hyperlink"/>
                 </w:rPr>
-                <w:t>제품 ↗</w:t>
+                <w:t>open62541 ↗</w:t>
+              </w:r>
+            </w:hyperlink>
+            <w:r>
+              <w:rPr/>
+              <w:br/>
+            </w:r>
+            <w:hyperlink r:id="rId45" w:tgtFrame="_blank">
+              <w:r>
+                <w:rPr>
+                  <w:rStyle w:val="Hyperlink"/>
+                </w:rPr>
+                <w:t>Apache PLC4X ↗</w:t>
               </w:r>
             </w:hyperlink>
             <w:bookmarkStart w:id="23" w:name="sw-AASIM"/>
@@ -24096,7 +24184,7 @@
         </w:tc>
         <w:tc>
           <w:tcPr>
-            <w:tcW w:w="1177" w:type="dxa"/>
+            <w:tcW w:w="1103" w:type="dxa"/>
             <w:tcBorders>
               <w:left w:val="single" w:sz="2" w:space="0" w:color="808080"/>
               <w:bottom w:val="single" w:sz="2" w:space="0" w:color="808080"/>
@@ -24180,7 +24268,7 @@
               <w:jc w:val="left"/>
               <w:rPr/>
             </w:pPr>
-            <w:hyperlink r:id="rId45" w:tgtFrame="_blank">
+            <w:hyperlink r:id="rId46" w:tgtFrame="_blank">
               <w:r>
                 <w:rPr>
                   <w:rStyle w:val="Hyperlink"/>
@@ -24198,7 +24286,7 @@
               <w:rPr/>
               <w:br/>
             </w:r>
-            <w:hyperlink r:id="rId46" w:tgtFrame="_blank">
+            <w:hyperlink r:id="rId47" w:tgtFrame="_blank">
               <w:r>
                 <w:rPr>
                   <w:rStyle w:val="Hyperlink"/>
@@ -24333,15 +24421,15 @@
             </w:pPr>
             <w:r>
               <w:rPr/>
-              <w:t xml:space="preserve">Kepware </w:t>
-            </w:r>
-            <w:r>
-              <w:rPr/>
-              <w:t xml:space="preserve">드라이버 </w:t>
-            </w:r>
-            <w:r>
-              <w:rPr/>
-              <w:t xml:space="preserve">+ </w:t>
+              <w:t xml:space="preserve">PLC4X </w:t>
+            </w:r>
+            <w:r>
+              <w:rPr/>
+              <w:t>드라이버</w:t>
+            </w:r>
+            <w:r>
+              <w:rPr/>
+              <w:t xml:space="preserve">(S7·Modbus·EtherNet/IP·ADS) + </w:t>
             </w:r>
             <w:r>
               <w:rPr/>
@@ -24377,7 +24465,15 @@
             </w:pPr>
             <w:r>
               <w:rPr/>
-              <w:t xml:space="preserve">PTC Kepware + </w:t>
+              <w:t>Apache (</w:t>
+            </w:r>
+            <w:r>
+              <w:rPr/>
+              <w:t>오픈소스</w:t>
+            </w:r>
+            <w:r>
+              <w:rPr/>
+              <w:t xml:space="preserve">) + </w:t>
             </w:r>
             <w:r>
               <w:rPr/>
@@ -24639,7 +24735,7 @@
         </w:tc>
         <w:tc>
           <w:tcPr>
-            <w:tcW w:w="1177" w:type="dxa"/>
+            <w:tcW w:w="1103" w:type="dxa"/>
             <w:tcBorders>
               <w:left w:val="single" w:sz="2" w:space="0" w:color="808080"/>
               <w:bottom w:val="single" w:sz="2" w:space="0" w:color="808080"/>
@@ -24677,27 +24773,11 @@
             </w:r>
             <w:r>
               <w:rPr/>
-              <w:t xml:space="preserve">). Kepware </w:t>
-            </w:r>
-            <w:r>
-              <w:rPr/>
-              <w:t xml:space="preserve">드라이버는 </w:t>
-            </w:r>
-            <w:r>
-              <w:rPr/>
-              <w:t xml:space="preserve">KEPServerEX </w:t>
-            </w:r>
-            <w:r>
-              <w:rPr/>
-              <w:t>라이선스에 포함</w:t>
-            </w:r>
-            <w:r>
-              <w:rPr/>
-              <w:t xml:space="preserve">, </w:t>
-            </w:r>
-            <w:r>
-              <w:rPr/>
-              <w:t xml:space="preserve">로봇 </w:t>
+              <w:t>). PLC4X</w:t>
+            </w:r>
+            <w:r>
+              <w:rPr/>
+              <w:t xml:space="preserve">에 없는 장비 고유 프로토콜과 로봇 </w:t>
             </w:r>
             <w:r>
               <w:rPr/>
@@ -24727,12 +24807,18 @@
               <w:jc w:val="left"/>
               <w:rPr/>
             </w:pPr>
-            <w:hyperlink r:id="rId47" w:tgtFrame="_blank">
+            <w:hyperlink r:id="rId48" w:tgtFrame="_blank">
               <w:r>
                 <w:rPr>
                   <w:rStyle w:val="Hyperlink"/>
                 </w:rPr>
-                <w:t>Kepware ↗</w:t>
+                <w:t xml:space="preserve">PLC4X </w:t>
+              </w:r>
+              <w:r>
+                <w:rPr>
+                  <w:rStyle w:val="Hyperlink"/>
+                </w:rPr>
+                <w:t>지원 프로토콜 ↗</w:t>
               </w:r>
             </w:hyperlink>
             <w:bookmarkStart w:id="25" w:name="sw-ETSDB"/>
@@ -25148,7 +25234,7 @@
         </w:tc>
         <w:tc>
           <w:tcPr>
-            <w:tcW w:w="1177" w:type="dxa"/>
+            <w:tcW w:w="1103" w:type="dxa"/>
             <w:tcBorders>
               <w:left w:val="single" w:sz="2" w:space="0" w:color="808080"/>
               <w:bottom w:val="single" w:sz="2" w:space="0" w:color="808080"/>
@@ -25188,7 +25274,7 @@
               <w:jc w:val="left"/>
               <w:rPr/>
             </w:pPr>
-            <w:hyperlink r:id="rId48" w:tgtFrame="_blank">
+            <w:hyperlink r:id="rId49" w:tgtFrame="_blank">
               <w:r>
                 <w:rPr>
                   <w:rStyle w:val="Hyperlink"/>
@@ -25673,7 +25759,7 @@
         </w:tc>
         <w:tc>
           <w:tcPr>
-            <w:tcW w:w="1177" w:type="dxa"/>
+            <w:tcW w:w="1103" w:type="dxa"/>
             <w:tcBorders>
               <w:left w:val="single" w:sz="2" w:space="0" w:color="808080"/>
               <w:bottom w:val="single" w:sz="2" w:space="0" w:color="808080"/>
@@ -26225,7 +26311,7 @@
         </w:tc>
         <w:tc>
           <w:tcPr>
-            <w:tcW w:w="1177" w:type="dxa"/>
+            <w:tcW w:w="1103" w:type="dxa"/>
             <w:tcBorders>
               <w:left w:val="single" w:sz="2" w:space="0" w:color="808080"/>
               <w:bottom w:val="single" w:sz="2" w:space="0" w:color="808080"/>
@@ -26273,7 +26359,7 @@
               <w:jc w:val="left"/>
               <w:rPr/>
             </w:pPr>
-            <w:hyperlink r:id="rId49" w:tgtFrame="_blank">
+            <w:hyperlink r:id="rId50" w:tgtFrame="_blank">
               <w:r>
                 <w:rPr>
                   <w:rStyle w:val="Hyperlink"/>
@@ -26742,7 +26828,7 @@
         </w:tc>
         <w:tc>
           <w:tcPr>
-            <w:tcW w:w="1177" w:type="dxa"/>
+            <w:tcW w:w="1103" w:type="dxa"/>
             <w:tcBorders>
               <w:left w:val="single" w:sz="2" w:space="0" w:color="808080"/>
               <w:bottom w:val="single" w:sz="2" w:space="0" w:color="808080"/>
@@ -26783,7 +26869,7 @@
               <w:jc w:val="left"/>
               <w:rPr/>
             </w:pPr>
-            <w:hyperlink r:id="rId50" w:tgtFrame="_blank">
+            <w:hyperlink r:id="rId51" w:tgtFrame="_blank">
               <w:r>
                 <w:rPr>
                   <w:rStyle w:val="Hyperlink"/>
@@ -26795,7 +26881,7 @@
               <w:rPr/>
               <w:br/>
             </w:r>
-            <w:hyperlink r:id="rId51" w:tgtFrame="_blank">
+            <w:hyperlink r:id="rId52" w:tgtFrame="_blank">
               <w:r>
                 <w:rPr>
                   <w:rStyle w:val="Hyperlink"/>
@@ -26807,7 +26893,7 @@
               <w:rPr/>
               <w:br/>
             </w:r>
-            <w:hyperlink r:id="rId52" w:tgtFrame="_blank">
+            <w:hyperlink r:id="rId53" w:tgtFrame="_blank">
               <w:r>
                 <w:rPr>
                   <w:rStyle w:val="Hyperlink"/>
@@ -26876,7 +26962,7 @@
         </w:tc>
         <w:tc>
           <w:tcPr>
-            <w:tcW w:w="9829" w:type="dxa"/>
+            <w:tcW w:w="9755" w:type="dxa"/>
             <w:gridSpan w:val="5"/>
             <w:tcBorders>
               <w:left w:val="single" w:sz="2" w:space="0" w:color="808080"/>
@@ -27311,7 +27397,7 @@
         </w:tc>
         <w:tc>
           <w:tcPr>
-            <w:tcW w:w="1177" w:type="dxa"/>
+            <w:tcW w:w="1103" w:type="dxa"/>
             <w:tcBorders>
               <w:left w:val="single" w:sz="2" w:space="0" w:color="808080"/>
               <w:bottom w:val="single" w:sz="2" w:space="0" w:color="808080"/>
@@ -27415,7 +27501,7 @@
               <w:jc w:val="left"/>
               <w:rPr/>
             </w:pPr>
-            <w:hyperlink r:id="rId53" w:tgtFrame="_blank">
+            <w:hyperlink r:id="rId54" w:tgtFrame="_blank">
               <w:r>
                 <w:rPr>
                   <w:rStyle w:val="Hyperlink"/>
@@ -27427,7 +27513,7 @@
               <w:rPr/>
               <w:br/>
             </w:r>
-            <w:hyperlink r:id="rId54" w:tgtFrame="_blank">
+            <w:hyperlink r:id="rId55" w:tgtFrame="_blank">
               <w:r>
                 <w:rPr>
                   <w:rStyle w:val="Hyperlink"/>
@@ -27880,7 +27966,7 @@
         </w:tc>
         <w:tc>
           <w:tcPr>
-            <w:tcW w:w="1177" w:type="dxa"/>
+            <w:tcW w:w="1103" w:type="dxa"/>
             <w:tcBorders>
               <w:left w:val="single" w:sz="2" w:space="0" w:color="808080"/>
               <w:bottom w:val="single" w:sz="2" w:space="0" w:color="808080"/>
@@ -27940,7 +28026,7 @@
               <w:jc w:val="left"/>
               <w:rPr/>
             </w:pPr>
-            <w:hyperlink r:id="rId55" w:tgtFrame="_blank">
+            <w:hyperlink r:id="rId56" w:tgtFrame="_blank">
               <w:r>
                 <w:rPr>
                   <w:rStyle w:val="Hyperlink"/>
@@ -28477,7 +28563,7 @@
         </w:tc>
         <w:tc>
           <w:tcPr>
-            <w:tcW w:w="1177" w:type="dxa"/>
+            <w:tcW w:w="1103" w:type="dxa"/>
             <w:tcBorders>
               <w:left w:val="single" w:sz="2" w:space="0" w:color="808080"/>
               <w:bottom w:val="single" w:sz="2" w:space="0" w:color="808080"/>
@@ -28565,7 +28651,7 @@
               <w:jc w:val="left"/>
               <w:rPr/>
             </w:pPr>
-            <w:hyperlink r:id="rId56" w:tgtFrame="_blank">
+            <w:hyperlink r:id="rId57" w:tgtFrame="_blank">
               <w:r>
                 <w:rPr>
                   <w:rStyle w:val="Hyperlink"/>
@@ -28583,7 +28669,7 @@
               <w:rPr/>
               <w:br/>
             </w:r>
-            <w:hyperlink r:id="rId57" w:tgtFrame="_blank">
+            <w:hyperlink r:id="rId58" w:tgtFrame="_blank">
               <w:r>
                 <w:rPr>
                   <w:rStyle w:val="Hyperlink"/>
@@ -29054,7 +29140,7 @@
         </w:tc>
         <w:tc>
           <w:tcPr>
-            <w:tcW w:w="1177" w:type="dxa"/>
+            <w:tcW w:w="1103" w:type="dxa"/>
             <w:tcBorders>
               <w:left w:val="single" w:sz="2" w:space="0" w:color="808080"/>
               <w:bottom w:val="single" w:sz="2" w:space="0" w:color="808080"/>
@@ -29114,7 +29200,7 @@
               <w:jc w:val="left"/>
               <w:rPr/>
             </w:pPr>
-            <w:hyperlink r:id="rId58" w:tgtFrame="_blank">
+            <w:hyperlink r:id="rId59" w:tgtFrame="_blank">
               <w:r>
                 <w:rPr>
                   <w:rStyle w:val="Hyperlink"/>
@@ -29126,7 +29212,7 @@
               <w:rPr/>
               <w:br/>
             </w:r>
-            <w:hyperlink r:id="rId59" w:tgtFrame="_blank">
+            <w:hyperlink r:id="rId60" w:tgtFrame="_blank">
               <w:r>
                 <w:rPr>
                   <w:rStyle w:val="Hyperlink"/>
@@ -29537,7 +29623,7 @@
         </w:tc>
         <w:tc>
           <w:tcPr>
-            <w:tcW w:w="1177" w:type="dxa"/>
+            <w:tcW w:w="1103" w:type="dxa"/>
             <w:tcBorders>
               <w:left w:val="single" w:sz="2" w:space="0" w:color="808080"/>
               <w:bottom w:val="single" w:sz="2" w:space="0" w:color="808080"/>
@@ -29597,7 +29683,7 @@
               <w:jc w:val="left"/>
               <w:rPr/>
             </w:pPr>
-            <w:hyperlink r:id="rId60" w:tgtFrame="_blank">
+            <w:hyperlink r:id="rId61" w:tgtFrame="_blank">
               <w:r>
                 <w:rPr>
                   <w:rStyle w:val="Hyperlink"/>
@@ -30066,7 +30152,7 @@
         </w:tc>
         <w:tc>
           <w:tcPr>
-            <w:tcW w:w="1177" w:type="dxa"/>
+            <w:tcW w:w="1103" w:type="dxa"/>
             <w:tcBorders>
               <w:left w:val="single" w:sz="2" w:space="0" w:color="808080"/>
               <w:bottom w:val="single" w:sz="2" w:space="0" w:color="808080"/>
@@ -30162,7 +30248,7 @@
               <w:jc w:val="left"/>
               <w:rPr/>
             </w:pPr>
-            <w:hyperlink r:id="rId61" w:tgtFrame="_blank">
+            <w:hyperlink r:id="rId62" w:tgtFrame="_blank">
               <w:r>
                 <w:rPr>
                   <w:rStyle w:val="Hyperlink"/>
@@ -30174,7 +30260,7 @@
               <w:rPr/>
               <w:br/>
             </w:r>
-            <w:hyperlink r:id="rId62" w:tgtFrame="_blank">
+            <w:hyperlink r:id="rId63" w:tgtFrame="_blank">
               <w:r>
                 <w:rPr>
                   <w:rStyle w:val="Hyperlink"/>
@@ -30653,7 +30739,7 @@
         </w:tc>
         <w:tc>
           <w:tcPr>
-            <w:tcW w:w="1177" w:type="dxa"/>
+            <w:tcW w:w="1103" w:type="dxa"/>
             <w:tcBorders>
               <w:left w:val="single" w:sz="2" w:space="0" w:color="808080"/>
               <w:bottom w:val="single" w:sz="2" w:space="0" w:color="808080"/>
@@ -30713,7 +30799,7 @@
               <w:jc w:val="left"/>
               <w:rPr/>
             </w:pPr>
-            <w:hyperlink r:id="rId63" w:tgtFrame="_blank">
+            <w:hyperlink r:id="rId64" w:tgtFrame="_blank">
               <w:r>
                 <w:rPr>
                   <w:rStyle w:val="Hyperlink"/>
@@ -31220,7 +31306,7 @@
         </w:tc>
         <w:tc>
           <w:tcPr>
-            <w:tcW w:w="1177" w:type="dxa"/>
+            <w:tcW w:w="1103" w:type="dxa"/>
             <w:tcBorders>
               <w:left w:val="single" w:sz="2" w:space="0" w:color="808080"/>
               <w:bottom w:val="single" w:sz="2" w:space="0" w:color="808080"/>
@@ -31316,7 +31402,7 @@
               <w:jc w:val="left"/>
               <w:rPr/>
             </w:pPr>
-            <w:hyperlink r:id="rId64" w:tgtFrame="_blank">
+            <w:hyperlink r:id="rId65" w:tgtFrame="_blank">
               <w:r>
                 <w:rPr>
                   <w:rStyle w:val="Hyperlink"/>
@@ -31334,7 +31420,7 @@
               <w:rPr/>
               <w:br/>
             </w:r>
-            <w:hyperlink r:id="rId65" w:tgtFrame="_blank">
+            <w:hyperlink r:id="rId66" w:tgtFrame="_blank">
               <w:r>
                 <w:rPr>
                   <w:rStyle w:val="Hyperlink"/>
@@ -31793,7 +31879,7 @@
         </w:tc>
         <w:tc>
           <w:tcPr>
-            <w:tcW w:w="1177" w:type="dxa"/>
+            <w:tcW w:w="1103" w:type="dxa"/>
             <w:tcBorders>
               <w:left w:val="single" w:sz="2" w:space="0" w:color="808080"/>
               <w:bottom w:val="single" w:sz="2" w:space="0" w:color="808080"/>
@@ -31854,7 +31940,7 @@
               <w:jc w:val="left"/>
               <w:rPr/>
             </w:pPr>
-            <w:hyperlink r:id="rId66" w:tgtFrame="_blank">
+            <w:hyperlink r:id="rId67" w:tgtFrame="_blank">
               <w:r>
                 <w:rPr>
                   <w:rStyle w:val="Hyperlink"/>
@@ -31929,7 +32015,7 @@
         </w:tc>
         <w:tc>
           <w:tcPr>
-            <w:tcW w:w="9829" w:type="dxa"/>
+            <w:tcW w:w="9755" w:type="dxa"/>
             <w:gridSpan w:val="5"/>
             <w:tcBorders>
               <w:left w:val="single" w:sz="2" w:space="0" w:color="808080"/>
@@ -32442,7 +32528,7 @@
         </w:tc>
         <w:tc>
           <w:tcPr>
-            <w:tcW w:w="1177" w:type="dxa"/>
+            <w:tcW w:w="1103" w:type="dxa"/>
             <w:tcBorders>
               <w:left w:val="single" w:sz="2" w:space="0" w:color="808080"/>
               <w:bottom w:val="single" w:sz="2" w:space="0" w:color="808080"/>
@@ -32904,7 +32990,7 @@
         </w:tc>
         <w:tc>
           <w:tcPr>
-            <w:tcW w:w="1177" w:type="dxa"/>
+            <w:tcW w:w="1103" w:type="dxa"/>
             <w:tcBorders>
               <w:left w:val="single" w:sz="2" w:space="0" w:color="808080"/>
               <w:bottom w:val="single" w:sz="2" w:space="0" w:color="808080"/>
@@ -33386,7 +33472,7 @@
         </w:tc>
         <w:tc>
           <w:tcPr>
-            <w:tcW w:w="1177" w:type="dxa"/>
+            <w:tcW w:w="1103" w:type="dxa"/>
             <w:tcBorders>
               <w:left w:val="single" w:sz="2" w:space="0" w:color="808080"/>
               <w:bottom w:val="single" w:sz="2" w:space="0" w:color="808080"/>
@@ -33426,7 +33512,7 @@
               <w:jc w:val="left"/>
               <w:rPr/>
             </w:pPr>
-            <w:hyperlink r:id="rId67" w:tgtFrame="_blank">
+            <w:hyperlink r:id="rId68" w:tgtFrame="_blank">
               <w:r>
                 <w:rPr>
                   <w:rStyle w:val="Hyperlink"/>
@@ -33855,7 +33941,7 @@
         </w:tc>
         <w:tc>
           <w:tcPr>
-            <w:tcW w:w="1177" w:type="dxa"/>
+            <w:tcW w:w="1103" w:type="dxa"/>
             <w:tcBorders>
               <w:left w:val="single" w:sz="2" w:space="0" w:color="808080"/>
               <w:bottom w:val="single" w:sz="2" w:space="0" w:color="808080"/>
@@ -33916,7 +34002,7 @@
               <w:jc w:val="left"/>
               <w:rPr/>
             </w:pPr>
-            <w:hyperlink r:id="rId68" w:tgtFrame="_blank">
+            <w:hyperlink r:id="rId69" w:tgtFrame="_blank">
               <w:r>
                 <w:rPr>
                   <w:rStyle w:val="Hyperlink"/>
@@ -33928,7 +34014,7 @@
               <w:rPr/>
               <w:br/>
             </w:r>
-            <w:hyperlink r:id="rId69" w:tgtFrame="_blank">
+            <w:hyperlink r:id="rId70" w:tgtFrame="_blank">
               <w:r>
                 <w:rPr>
                   <w:rStyle w:val="Hyperlink"/>
@@ -34015,7 +34101,7 @@
         </w:tc>
         <w:tc>
           <w:tcPr>
-            <w:tcW w:w="9829" w:type="dxa"/>
+            <w:tcW w:w="9755" w:type="dxa"/>
             <w:gridSpan w:val="5"/>
             <w:tcBorders>
               <w:left w:val="single" w:sz="2" w:space="0" w:color="808080"/>
@@ -34478,7 +34564,7 @@
         </w:tc>
         <w:tc>
           <w:tcPr>
-            <w:tcW w:w="1177" w:type="dxa"/>
+            <w:tcW w:w="1103" w:type="dxa"/>
             <w:tcBorders>
               <w:left w:val="single" w:sz="2" w:space="0" w:color="808080"/>
               <w:bottom w:val="single" w:sz="2" w:space="0" w:color="808080"/>
@@ -34530,7 +34616,7 @@
               <w:jc w:val="left"/>
               <w:rPr/>
             </w:pPr>
-            <w:hyperlink r:id="rId70" w:tgtFrame="_blank">
+            <w:hyperlink r:id="rId71" w:tgtFrame="_blank">
               <w:r>
                 <w:rPr>
                   <w:rStyle w:val="Hyperlink"/>
@@ -34542,7 +34628,7 @@
               <w:rPr/>
               <w:br/>
             </w:r>
-            <w:hyperlink r:id="rId71" w:tgtFrame="_blank">
+            <w:hyperlink r:id="rId72" w:tgtFrame="_blank">
               <w:r>
                 <w:rPr>
                   <w:rStyle w:val="Hyperlink"/>
@@ -34981,7 +35067,7 @@
         </w:tc>
         <w:tc>
           <w:tcPr>
-            <w:tcW w:w="1177" w:type="dxa"/>
+            <w:tcW w:w="1103" w:type="dxa"/>
             <w:tcBorders>
               <w:left w:val="single" w:sz="2" w:space="0" w:color="808080"/>
               <w:bottom w:val="single" w:sz="2" w:space="0" w:color="808080"/>
@@ -35103,7 +35189,7 @@
             </w:pPr>
             <w:r>
               <w:rPr/>
-              <w:t xml:space="preserve">248,000 </w:t>
+              <w:t xml:space="preserve">173,000 </w:t>
             </w:r>
             <w:r>
               <w:rPr/>
@@ -35113,7 +35199,7 @@
         </w:tc>
         <w:tc>
           <w:tcPr>
-            <w:tcW w:w="7973" w:type="dxa"/>
+            <w:tcW w:w="7899" w:type="dxa"/>
             <w:gridSpan w:val="4"/>
             <w:tcBorders>
               <w:left w:val="single" w:sz="2" w:space="0" w:color="808080"/>
@@ -36417,7 +36503,7 @@
               <w:jc w:val="left"/>
               <w:rPr/>
             </w:pPr>
-            <w:hyperlink r:id="rId72" w:tgtFrame="_blank">
+            <w:hyperlink r:id="rId73" w:tgtFrame="_blank">
               <w:r>
                 <w:rPr>
                   <w:rStyle w:val="Hyperlink"/>
@@ -36435,7 +36521,7 @@
               <w:rPr/>
               <w:br/>
             </w:r>
-            <w:hyperlink r:id="rId73" w:tgtFrame="_blank">
+            <w:hyperlink r:id="rId74" w:tgtFrame="_blank">
               <w:r>
                 <w:rPr>
                   <w:rStyle w:val="Hyperlink"/>
@@ -36465,7 +36551,7 @@
               <w:rPr/>
               <w:br/>
             </w:r>
-            <w:hyperlink r:id="rId74" w:tgtFrame="_blank">
+            <w:hyperlink r:id="rId75" w:tgtFrame="_blank">
               <w:r>
                 <w:rPr>
                   <w:rStyle w:val="Hyperlink"/>
@@ -36963,7 +37049,7 @@
               <w:jc w:val="left"/>
               <w:rPr/>
             </w:pPr>
-            <w:hyperlink r:id="rId75" w:tgtFrame="_blank">
+            <w:hyperlink r:id="rId76" w:tgtFrame="_blank">
               <w:r>
                 <w:rPr>
                   <w:rStyle w:val="Hyperlink"/>
@@ -36981,7 +37067,7 @@
               <w:rPr/>
               <w:br/>
             </w:r>
-            <w:hyperlink r:id="rId76" w:tgtFrame="_blank">
+            <w:hyperlink r:id="rId77" w:tgtFrame="_blank">
               <w:r>
                 <w:rPr>
                   <w:rStyle w:val="Hyperlink"/>
@@ -36999,7 +37085,7 @@
               <w:rPr/>
               <w:br/>
             </w:r>
-            <w:hyperlink r:id="rId77" w:tgtFrame="_blank">
+            <w:hyperlink r:id="rId78" w:tgtFrame="_blank">
               <w:r>
                 <w:rPr>
                   <w:rStyle w:val="Hyperlink"/>
@@ -38523,7 +38609,7 @@
               <w:jc w:val="left"/>
               <w:rPr/>
             </w:pPr>
-            <w:hyperlink r:id="rId78" w:tgtFrame="_blank">
+            <w:hyperlink r:id="rId79" w:tgtFrame="_blank">
               <w:r>
                 <w:rPr>
                   <w:rStyle w:val="Hyperlink"/>
@@ -38559,7 +38645,7 @@
               <w:rPr/>
               <w:br/>
             </w:r>
-            <w:hyperlink r:id="rId79" w:tgtFrame="_blank">
+            <w:hyperlink r:id="rId80" w:tgtFrame="_blank">
               <w:r>
                 <w:rPr>
                   <w:rStyle w:val="Hyperlink"/>
@@ -39514,7 +39600,7 @@
               <w:jc w:val="left"/>
               <w:rPr/>
             </w:pPr>
-            <w:hyperlink r:id="rId80" w:tgtFrame="_blank">
+            <w:hyperlink r:id="rId81" w:tgtFrame="_blank">
               <w:r>
                 <w:rPr>
                   <w:rStyle w:val="Hyperlink"/>
@@ -40635,7 +40721,7 @@
               <w:jc w:val="left"/>
               <w:rPr/>
             </w:pPr>
-            <w:hyperlink r:id="rId81" w:tgtFrame="_blank">
+            <w:hyperlink r:id="rId82" w:tgtFrame="_blank">
               <w:r>
                 <w:rPr>
                   <w:rStyle w:val="Hyperlink"/>
@@ -41025,7 +41111,7 @@
               <w:jc w:val="left"/>
               <w:rPr/>
             </w:pPr>
-            <w:hyperlink r:id="rId82" w:tgtFrame="_blank">
+            <w:hyperlink r:id="rId83" w:tgtFrame="_blank">
               <w:r>
                 <w:rPr>
                   <w:rStyle w:val="Hyperlink"/>
@@ -41037,7 +41123,7 @@
               <w:rPr/>
               <w:br/>
             </w:r>
-            <w:hyperlink r:id="rId83" w:tgtFrame="_blank">
+            <w:hyperlink r:id="rId84" w:tgtFrame="_blank">
               <w:r>
                 <w:rPr>
                   <w:rStyle w:val="Hyperlink"/>
@@ -42015,7 +42101,7 @@
               <w:jc w:val="left"/>
               <w:rPr/>
             </w:pPr>
-            <w:hyperlink r:id="rId84" w:tgtFrame="_blank">
+            <w:hyperlink r:id="rId85" w:tgtFrame="_blank">
               <w:r>
                 <w:rPr>
                   <w:rStyle w:val="Hyperlink"/>
@@ -42996,7 +43082,7 @@
               <w:jc w:val="left"/>
               <w:rPr/>
             </w:pPr>
-            <w:hyperlink r:id="rId85" w:tgtFrame="_blank">
+            <w:hyperlink r:id="rId86" w:tgtFrame="_blank">
               <w:r>
                 <w:rPr>
                   <w:rStyle w:val="Hyperlink"/>
@@ -43881,7 +43967,7 @@
               <w:jc w:val="left"/>
               <w:rPr/>
             </w:pPr>
-            <w:hyperlink r:id="rId86" w:tgtFrame="_blank">
+            <w:hyperlink r:id="rId87" w:tgtFrame="_blank">
               <w:r>
                 <w:rPr>
                   <w:rStyle w:val="Hyperlink"/>
@@ -44259,7 +44345,7 @@
               <w:jc w:val="left"/>
               <w:rPr/>
             </w:pPr>
-            <w:hyperlink r:id="rId87" w:tgtFrame="_blank">
+            <w:hyperlink r:id="rId88" w:tgtFrame="_blank">
               <w:r>
                 <w:rPr>
                   <w:rStyle w:val="Hyperlink"/>
@@ -45165,7 +45251,7 @@
               <w:jc w:val="left"/>
               <w:rPr/>
             </w:pPr>
-            <w:hyperlink r:id="rId88" w:tgtFrame="_blank">
+            <w:hyperlink r:id="rId89" w:tgtFrame="_blank">
               <w:r>
                 <w:rPr>
                   <w:rStyle w:val="Hyperlink"/>
@@ -45328,10 +45414,10 @@
       </w:tblPr>
       <w:tblGrid>
         <w:gridCol w:w="754"/>
-        <w:gridCol w:w="1014"/>
-        <w:gridCol w:w="4325"/>
-        <w:gridCol w:w="2486"/>
-        <w:gridCol w:w="2760"/>
+        <w:gridCol w:w="976"/>
+        <w:gridCol w:w="3874"/>
+        <w:gridCol w:w="2245"/>
+        <w:gridCol w:w="3490"/>
       </w:tblGrid>
       <w:tr>
         <w:trPr>
@@ -45366,7 +45452,7 @@
         </w:tc>
         <w:tc>
           <w:tcPr>
-            <w:tcW w:w="1014" w:type="dxa"/>
+            <w:tcW w:w="976" w:type="dxa"/>
             <w:tcBorders>
               <w:top w:val="single" w:sz="6" w:space="0" w:color="808080"/>
               <w:left w:val="single" w:sz="2" w:space="0" w:color="808080"/>
@@ -45393,7 +45479,7 @@
         </w:tc>
         <w:tc>
           <w:tcPr>
-            <w:tcW w:w="4325" w:type="dxa"/>
+            <w:tcW w:w="3874" w:type="dxa"/>
             <w:tcBorders>
               <w:top w:val="single" w:sz="6" w:space="0" w:color="808080"/>
               <w:left w:val="single" w:sz="2" w:space="0" w:color="808080"/>
@@ -45428,7 +45514,7 @@
         </w:tc>
         <w:tc>
           <w:tcPr>
-            <w:tcW w:w="2486" w:type="dxa"/>
+            <w:tcW w:w="2245" w:type="dxa"/>
             <w:tcBorders>
               <w:top w:val="single" w:sz="6" w:space="0" w:color="808080"/>
               <w:left w:val="single" w:sz="2" w:space="0" w:color="808080"/>
@@ -45455,7 +45541,7 @@
         </w:tc>
         <w:tc>
           <w:tcPr>
-            <w:tcW w:w="2760" w:type="dxa"/>
+            <w:tcW w:w="3490" w:type="dxa"/>
             <w:tcBorders>
               <w:top w:val="single" w:sz="6" w:space="0" w:color="808080"/>
               <w:left w:val="single" w:sz="2" w:space="0" w:color="808080"/>
@@ -45510,7 +45596,7 @@
         </w:tc>
         <w:tc>
           <w:tcPr>
-            <w:tcW w:w="1014" w:type="dxa"/>
+            <w:tcW w:w="976" w:type="dxa"/>
             <w:tcBorders>
               <w:left w:val="single" w:sz="2" w:space="0" w:color="808080"/>
               <w:bottom w:val="single" w:sz="2" w:space="0" w:color="808080"/>
@@ -45539,7 +45625,7 @@
         </w:tc>
         <w:tc>
           <w:tcPr>
-            <w:tcW w:w="4325" w:type="dxa"/>
+            <w:tcW w:w="3874" w:type="dxa"/>
             <w:tcBorders>
               <w:left w:val="single" w:sz="2" w:space="0" w:color="808080"/>
               <w:bottom w:val="single" w:sz="2" w:space="0" w:color="808080"/>
@@ -45587,7 +45673,7 @@
         </w:tc>
         <w:tc>
           <w:tcPr>
-            <w:tcW w:w="2486" w:type="dxa"/>
+            <w:tcW w:w="2245" w:type="dxa"/>
             <w:tcBorders>
               <w:left w:val="single" w:sz="2" w:space="0" w:color="808080"/>
               <w:bottom w:val="single" w:sz="2" w:space="0" w:color="808080"/>
@@ -45611,7 +45697,7 @@
         </w:tc>
         <w:tc>
           <w:tcPr>
-            <w:tcW w:w="2760" w:type="dxa"/>
+            <w:tcW w:w="3490" w:type="dxa"/>
             <w:tcBorders>
               <w:left w:val="single" w:sz="2" w:space="0" w:color="808080"/>
               <w:bottom w:val="single" w:sz="2" w:space="0" w:color="808080"/>
@@ -45671,7 +45757,7 @@
         </w:tc>
         <w:tc>
           <w:tcPr>
-            <w:tcW w:w="1014" w:type="dxa"/>
+            <w:tcW w:w="976" w:type="dxa"/>
             <w:tcBorders>
               <w:left w:val="single" w:sz="2" w:space="0" w:color="808080"/>
               <w:bottom w:val="single" w:sz="2" w:space="0" w:color="808080"/>
@@ -45700,7 +45786,7 @@
         </w:tc>
         <w:tc>
           <w:tcPr>
-            <w:tcW w:w="4325" w:type="dxa"/>
+            <w:tcW w:w="3874" w:type="dxa"/>
             <w:tcBorders>
               <w:left w:val="single" w:sz="2" w:space="0" w:color="808080"/>
               <w:bottom w:val="single" w:sz="2" w:space="0" w:color="808080"/>
@@ -45800,7 +45886,7 @@
         </w:tc>
         <w:tc>
           <w:tcPr>
-            <w:tcW w:w="2486" w:type="dxa"/>
+            <w:tcW w:w="2245" w:type="dxa"/>
             <w:tcBorders>
               <w:left w:val="single" w:sz="2" w:space="0" w:color="808080"/>
               <w:bottom w:val="single" w:sz="2" w:space="0" w:color="808080"/>
@@ -45824,7 +45910,7 @@
         </w:tc>
         <w:tc>
           <w:tcPr>
-            <w:tcW w:w="2760" w:type="dxa"/>
+            <w:tcW w:w="3490" w:type="dxa"/>
             <w:tcBorders>
               <w:left w:val="single" w:sz="2" w:space="0" w:color="808080"/>
               <w:bottom w:val="single" w:sz="2" w:space="0" w:color="808080"/>
@@ -45884,7 +45970,7 @@
         </w:tc>
         <w:tc>
           <w:tcPr>
-            <w:tcW w:w="1014" w:type="dxa"/>
+            <w:tcW w:w="976" w:type="dxa"/>
             <w:tcBorders>
               <w:left w:val="single" w:sz="2" w:space="0" w:color="808080"/>
               <w:bottom w:val="single" w:sz="2" w:space="0" w:color="808080"/>
@@ -45919,7 +46005,7 @@
         </w:tc>
         <w:tc>
           <w:tcPr>
-            <w:tcW w:w="4325" w:type="dxa"/>
+            <w:tcW w:w="3874" w:type="dxa"/>
             <w:tcBorders>
               <w:left w:val="single" w:sz="2" w:space="0" w:color="808080"/>
               <w:bottom w:val="single" w:sz="2" w:space="0" w:color="808080"/>
@@ -45987,7 +46073,7 @@
         </w:tc>
         <w:tc>
           <w:tcPr>
-            <w:tcW w:w="2486" w:type="dxa"/>
+            <w:tcW w:w="2245" w:type="dxa"/>
             <w:tcBorders>
               <w:left w:val="single" w:sz="2" w:space="0" w:color="808080"/>
               <w:bottom w:val="single" w:sz="2" w:space="0" w:color="808080"/>
@@ -46027,7 +46113,7 @@
         </w:tc>
         <w:tc>
           <w:tcPr>
-            <w:tcW w:w="2760" w:type="dxa"/>
+            <w:tcW w:w="3490" w:type="dxa"/>
             <w:tcBorders>
               <w:left w:val="single" w:sz="2" w:space="0" w:color="808080"/>
               <w:bottom w:val="single" w:sz="2" w:space="0" w:color="808080"/>
@@ -46119,7 +46205,7 @@
         </w:tc>
         <w:tc>
           <w:tcPr>
-            <w:tcW w:w="1014" w:type="dxa"/>
+            <w:tcW w:w="976" w:type="dxa"/>
             <w:tcBorders>
               <w:left w:val="single" w:sz="2" w:space="0" w:color="808080"/>
               <w:bottom w:val="single" w:sz="2" w:space="0" w:color="808080"/>
@@ -46148,7 +46234,7 @@
         </w:tc>
         <w:tc>
           <w:tcPr>
-            <w:tcW w:w="4325" w:type="dxa"/>
+            <w:tcW w:w="3874" w:type="dxa"/>
             <w:tcBorders>
               <w:left w:val="single" w:sz="2" w:space="0" w:color="808080"/>
               <w:bottom w:val="single" w:sz="2" w:space="0" w:color="808080"/>
@@ -46256,7 +46342,7 @@
         </w:tc>
         <w:tc>
           <w:tcPr>
-            <w:tcW w:w="2486" w:type="dxa"/>
+            <w:tcW w:w="2245" w:type="dxa"/>
             <w:tcBorders>
               <w:left w:val="single" w:sz="2" w:space="0" w:color="808080"/>
               <w:bottom w:val="single" w:sz="2" w:space="0" w:color="808080"/>
@@ -46280,7 +46366,7 @@
         </w:tc>
         <w:tc>
           <w:tcPr>
-            <w:tcW w:w="2760" w:type="dxa"/>
+            <w:tcW w:w="3490" w:type="dxa"/>
             <w:tcBorders>
               <w:left w:val="single" w:sz="2" w:space="0" w:color="808080"/>
               <w:bottom w:val="single" w:sz="2" w:space="0" w:color="808080"/>
@@ -46340,7 +46426,7 @@
         </w:tc>
         <w:tc>
           <w:tcPr>
-            <w:tcW w:w="1014" w:type="dxa"/>
+            <w:tcW w:w="976" w:type="dxa"/>
             <w:tcBorders>
               <w:left w:val="single" w:sz="2" w:space="0" w:color="808080"/>
               <w:bottom w:val="single" w:sz="2" w:space="0" w:color="808080"/>
@@ -46375,7 +46461,7 @@
         </w:tc>
         <w:tc>
           <w:tcPr>
-            <w:tcW w:w="4325" w:type="dxa"/>
+            <w:tcW w:w="3874" w:type="dxa"/>
             <w:tcBorders>
               <w:left w:val="single" w:sz="2" w:space="0" w:color="808080"/>
               <w:bottom w:val="single" w:sz="2" w:space="0" w:color="808080"/>
@@ -46419,7 +46505,7 @@
         </w:tc>
         <w:tc>
           <w:tcPr>
-            <w:tcW w:w="2486" w:type="dxa"/>
+            <w:tcW w:w="2245" w:type="dxa"/>
             <w:tcBorders>
               <w:left w:val="single" w:sz="2" w:space="0" w:color="808080"/>
               <w:bottom w:val="single" w:sz="2" w:space="0" w:color="808080"/>
@@ -46451,7 +46537,7 @@
         </w:tc>
         <w:tc>
           <w:tcPr>
-            <w:tcW w:w="2760" w:type="dxa"/>
+            <w:tcW w:w="3490" w:type="dxa"/>
             <w:tcBorders>
               <w:left w:val="single" w:sz="2" w:space="0" w:color="808080"/>
               <w:bottom w:val="single" w:sz="2" w:space="0" w:color="808080"/>
@@ -46531,7 +46617,7 @@
         </w:tc>
         <w:tc>
           <w:tcPr>
-            <w:tcW w:w="1014" w:type="dxa"/>
+            <w:tcW w:w="976" w:type="dxa"/>
             <w:tcBorders>
               <w:left w:val="single" w:sz="2" w:space="0" w:color="808080"/>
               <w:bottom w:val="single" w:sz="2" w:space="0" w:color="808080"/>
@@ -46566,7 +46652,7 @@
         </w:tc>
         <w:tc>
           <w:tcPr>
-            <w:tcW w:w="4325" w:type="dxa"/>
+            <w:tcW w:w="3874" w:type="dxa"/>
             <w:tcBorders>
               <w:left w:val="single" w:sz="2" w:space="0" w:color="808080"/>
               <w:bottom w:val="single" w:sz="2" w:space="0" w:color="808080"/>
@@ -46610,7 +46696,7 @@
         </w:tc>
         <w:tc>
           <w:tcPr>
-            <w:tcW w:w="2486" w:type="dxa"/>
+            <w:tcW w:w="2245" w:type="dxa"/>
             <w:tcBorders>
               <w:left w:val="single" w:sz="2" w:space="0" w:color="808080"/>
               <w:bottom w:val="single" w:sz="2" w:space="0" w:color="808080"/>
@@ -46638,7 +46724,7 @@
         </w:tc>
         <w:tc>
           <w:tcPr>
-            <w:tcW w:w="2760" w:type="dxa"/>
+            <w:tcW w:w="3490" w:type="dxa"/>
             <w:tcBorders>
               <w:left w:val="single" w:sz="2" w:space="0" w:color="808080"/>
               <w:bottom w:val="single" w:sz="2" w:space="0" w:color="808080"/>
@@ -46698,7 +46784,7 @@
         </w:tc>
         <w:tc>
           <w:tcPr>
-            <w:tcW w:w="1014" w:type="dxa"/>
+            <w:tcW w:w="976" w:type="dxa"/>
             <w:tcBorders>
               <w:left w:val="single" w:sz="2" w:space="0" w:color="808080"/>
               <w:bottom w:val="single" w:sz="2" w:space="0" w:color="808080"/>
@@ -46727,7 +46813,7 @@
         </w:tc>
         <w:tc>
           <w:tcPr>
-            <w:tcW w:w="4325" w:type="dxa"/>
+            <w:tcW w:w="3874" w:type="dxa"/>
             <w:tcBorders>
               <w:left w:val="single" w:sz="2" w:space="0" w:color="808080"/>
               <w:bottom w:val="single" w:sz="2" w:space="0" w:color="808080"/>
@@ -46807,7 +46893,7 @@
         </w:tc>
         <w:tc>
           <w:tcPr>
-            <w:tcW w:w="2486" w:type="dxa"/>
+            <w:tcW w:w="2245" w:type="dxa"/>
             <w:tcBorders>
               <w:left w:val="single" w:sz="2" w:space="0" w:color="808080"/>
               <w:bottom w:val="single" w:sz="2" w:space="0" w:color="808080"/>
@@ -46843,7 +46929,7 @@
         </w:tc>
         <w:tc>
           <w:tcPr>
-            <w:tcW w:w="2760" w:type="dxa"/>
+            <w:tcW w:w="3490" w:type="dxa"/>
             <w:tcBorders>
               <w:left w:val="single" w:sz="2" w:space="0" w:color="808080"/>
               <w:bottom w:val="single" w:sz="2" w:space="0" w:color="808080"/>
@@ -46889,13 +46975,202 @@
             </w:pPr>
             <w:r>
               <w:rPr/>
+              <w:t>기술</w:t>
+            </w:r>
+          </w:p>
+        </w:tc>
+        <w:tc>
+          <w:tcPr>
+            <w:tcW w:w="976" w:type="dxa"/>
+            <w:tcBorders>
+              <w:left w:val="single" w:sz="2" w:space="0" w:color="808080"/>
+              <w:bottom w:val="single" w:sz="2" w:space="0" w:color="808080"/>
+              <w:right w:val="single" w:sz="6" w:space="0" w:color="808080"/>
+            </w:tcBorders>
+            <w:shd w:fill="EEF2F9" w:val="clear"/>
+            <w:vAlign w:val="center"/>
+          </w:tcPr>
+          <w:p>
+            <w:pPr>
+              <w:pStyle w:val="TableHeading"/>
+              <w:bidi w:val="0"/>
+              <w:spacing w:before="0" w:after="283"/>
+              <w:jc w:val="left"/>
+              <w:rPr>
+                <w:color w:val="1B3A73"/>
+              </w:rPr>
+            </w:pPr>
+            <w:r>
+              <w:rPr>
+                <w:color w:val="1B3A73"/>
+              </w:rPr>
+              <w:t>장비 통신 방식</w:t>
+            </w:r>
+          </w:p>
+        </w:tc>
+        <w:tc>
+          <w:tcPr>
+            <w:tcW w:w="3874" w:type="dxa"/>
+            <w:tcBorders>
+              <w:left w:val="single" w:sz="2" w:space="0" w:color="808080"/>
+              <w:bottom w:val="single" w:sz="2" w:space="0" w:color="808080"/>
+              <w:right w:val="single" w:sz="6" w:space="0" w:color="808080"/>
+            </w:tcBorders>
+            <w:vAlign w:val="center"/>
+          </w:tcPr>
+          <w:p>
+            <w:pPr>
+              <w:pStyle w:val="TableContents"/>
+              <w:bidi w:val="0"/>
+              <w:spacing w:before="0" w:after="283"/>
+              <w:jc w:val="left"/>
+              <w:rPr/>
+            </w:pPr>
+            <w:r>
+              <w:rPr/>
+              <w:t xml:space="preserve">OPC UA </w:t>
+            </w:r>
+            <w:r>
+              <w:rPr/>
+              <w:t>수집을 오픈소스</w:t>
+            </w:r>
+            <w:r>
+              <w:rPr/>
+              <w:t>(open62541·PLC4X)</w:t>
+            </w:r>
+            <w:r>
+              <w:rPr/>
+              <w:t>로 자체 구성</w:t>
+            </w:r>
+            <w:r>
+              <w:rPr/>
+              <w:t xml:space="preserve">, Kepware </w:t>
+            </w:r>
+            <w:r>
+              <w:rPr/>
+              <w:t>미사용</w:t>
+            </w:r>
+          </w:p>
+        </w:tc>
+        <w:tc>
+          <w:tcPr>
+            <w:tcW w:w="2245" w:type="dxa"/>
+            <w:tcBorders>
+              <w:left w:val="single" w:sz="2" w:space="0" w:color="808080"/>
+              <w:bottom w:val="single" w:sz="2" w:space="0" w:color="808080"/>
+              <w:right w:val="single" w:sz="6" w:space="0" w:color="808080"/>
+            </w:tcBorders>
+            <w:vAlign w:val="center"/>
+          </w:tcPr>
+          <w:p>
+            <w:pPr>
+              <w:pStyle w:val="TableContents"/>
+              <w:bidi w:val="0"/>
+              <w:spacing w:before="0" w:after="283"/>
+              <w:jc w:val="left"/>
+              <w:rPr/>
+            </w:pPr>
+            <w:r>
+              <w:rPr/>
+              <w:t>고유 프로토콜 장비가 많으면 드라이버 개발 부담 증가</w:t>
+            </w:r>
+          </w:p>
+        </w:tc>
+        <w:tc>
+          <w:tcPr>
+            <w:tcW w:w="3490" w:type="dxa"/>
+            <w:tcBorders>
+              <w:left w:val="single" w:sz="2" w:space="0" w:color="808080"/>
+              <w:bottom w:val="single" w:sz="2" w:space="0" w:color="808080"/>
+              <w:right w:val="single" w:sz="6" w:space="0" w:color="808080"/>
+            </w:tcBorders>
+            <w:vAlign w:val="center"/>
+          </w:tcPr>
+          <w:p>
+            <w:pPr>
+              <w:pStyle w:val="TableContents"/>
+              <w:bidi w:val="0"/>
+              <w:spacing w:before="0" w:after="283"/>
+              <w:jc w:val="left"/>
+              <w:rPr/>
+            </w:pPr>
+            <w:r>
+              <w:rPr/>
+              <w:t xml:space="preserve">셀 장비 발주 사양에 </w:t>
+            </w:r>
+            <w:r>
+              <w:rPr/>
+              <w:t xml:space="preserve">'OPC UA </w:t>
+            </w:r>
+            <w:r>
+              <w:rPr/>
+              <w:t xml:space="preserve">서버 내장 또는 </w:t>
+            </w:r>
+            <w:r>
+              <w:rPr/>
+              <w:t xml:space="preserve">Modbus·EtherNet/IP </w:t>
+            </w:r>
+            <w:r>
+              <w:rPr/>
+              <w:t>지원</w:t>
+            </w:r>
+            <w:r>
+              <w:rPr/>
+              <w:t xml:space="preserve">' </w:t>
+            </w:r>
+            <w:r>
+              <w:rPr/>
+              <w:t>명시</w:t>
+            </w:r>
+            <w:r>
+              <w:rPr/>
+              <w:t xml:space="preserve">, </w:t>
+            </w:r>
+            <w:r>
+              <w:rPr/>
+              <w:t xml:space="preserve">예외 장비는 </w:t>
+            </w:r>
+            <w:r>
+              <w:rPr/>
+              <w:t>Kepware 1~2</w:t>
+            </w:r>
+            <w:r>
+              <w:rPr/>
+              <w:t>카피로 보완</w:t>
+            </w:r>
+          </w:p>
+        </w:tc>
+      </w:tr>
+      <w:tr>
+        <w:trPr/>
+        <w:tc>
+          <w:tcPr>
+            <w:tcW w:w="754" w:type="dxa"/>
+            <w:tcBorders>
+              <w:left w:val="single" w:sz="6" w:space="0" w:color="808080"/>
+              <w:bottom w:val="single" w:sz="2" w:space="0" w:color="808080"/>
+              <w:right w:val="single" w:sz="6" w:space="0" w:color="808080"/>
+            </w:tcBorders>
+            <w:vAlign w:val="center"/>
+          </w:tcPr>
+          <w:p>
+            <w:pPr>
+              <w:pStyle w:val="TableContents"/>
+              <w:bidi w:val="0"/>
+              <w:spacing w:before="0" w:after="283"/>
+              <w:ind w:hanging="0" w:left="0" w:right="0"/>
+              <w:jc w:val="left"/>
+              <w:rPr/>
+            </w:pPr>
+            <w:r>
+              <w:rPr/>
               <w:t>데이터</w:t>
             </w:r>
           </w:p>
         </w:tc>
         <w:tc>
           <w:tcPr>
-            <w:tcW w:w="1014" w:type="dxa"/>
+            <w:tcW w:w="976" w:type="dxa"/>
             <w:tcBorders>
               <w:left w:val="single" w:sz="2" w:space="0" w:color="808080"/>
               <w:bottom w:val="single" w:sz="2" w:space="0" w:color="808080"/>
@@ -46924,7 +47199,7 @@
         </w:tc>
         <w:tc>
           <w:tcPr>
-            <w:tcW w:w="4325" w:type="dxa"/>
+            <w:tcW w:w="3874" w:type="dxa"/>
             <w:tcBorders>
               <w:left w:val="single" w:sz="2" w:space="0" w:color="808080"/>
               <w:bottom w:val="single" w:sz="2" w:space="0" w:color="808080"/>
@@ -46972,7 +47247,7 @@
         </w:tc>
         <w:tc>
           <w:tcPr>
-            <w:tcW w:w="2486" w:type="dxa"/>
+            <w:tcW w:w="2245" w:type="dxa"/>
             <w:tcBorders>
               <w:left w:val="single" w:sz="2" w:space="0" w:color="808080"/>
               <w:bottom w:val="single" w:sz="2" w:space="0" w:color="808080"/>
@@ -47016,7 +47291,7 @@
         </w:tc>
         <w:tc>
           <w:tcPr>
-            <w:tcW w:w="2760" w:type="dxa"/>
+            <w:tcW w:w="3490" w:type="dxa"/>
             <w:tcBorders>
               <w:left w:val="single" w:sz="2" w:space="0" w:color="808080"/>
               <w:bottom w:val="single" w:sz="2" w:space="0" w:color="808080"/>
@@ -47076,7 +47351,7 @@
         </w:tc>
         <w:tc>
           <w:tcPr>
-            <w:tcW w:w="1014" w:type="dxa"/>
+            <w:tcW w:w="976" w:type="dxa"/>
             <w:tcBorders>
               <w:left w:val="single" w:sz="2" w:space="0" w:color="808080"/>
               <w:bottom w:val="single" w:sz="2" w:space="0" w:color="808080"/>
@@ -47105,7 +47380,7 @@
         </w:tc>
         <w:tc>
           <w:tcPr>
-            <w:tcW w:w="4325" w:type="dxa"/>
+            <w:tcW w:w="3874" w:type="dxa"/>
             <w:tcBorders>
               <w:left w:val="single" w:sz="2" w:space="0" w:color="808080"/>
               <w:bottom w:val="single" w:sz="2" w:space="0" w:color="808080"/>
@@ -47157,7 +47432,7 @@
         </w:tc>
         <w:tc>
           <w:tcPr>
-            <w:tcW w:w="2486" w:type="dxa"/>
+            <w:tcW w:w="2245" w:type="dxa"/>
             <w:tcBorders>
               <w:left w:val="single" w:sz="2" w:space="0" w:color="808080"/>
               <w:bottom w:val="single" w:sz="2" w:space="0" w:color="808080"/>
@@ -47189,7 +47464,7 @@
         </w:tc>
         <w:tc>
           <w:tcPr>
-            <w:tcW w:w="2760" w:type="dxa"/>
+            <w:tcW w:w="3490" w:type="dxa"/>
             <w:tcBorders>
               <w:left w:val="single" w:sz="2" w:space="0" w:color="808080"/>
               <w:bottom w:val="single" w:sz="2" w:space="0" w:color="808080"/>
@@ -47265,7 +47540,7 @@
         </w:tc>
         <w:tc>
           <w:tcPr>
-            <w:tcW w:w="1014" w:type="dxa"/>
+            <w:tcW w:w="976" w:type="dxa"/>
             <w:tcBorders>
               <w:left w:val="single" w:sz="2" w:space="0" w:color="808080"/>
               <w:bottom w:val="single" w:sz="6" w:space="0" w:color="808080"/>
@@ -47294,7 +47569,7 @@
         </w:tc>
         <w:tc>
           <w:tcPr>
-            <w:tcW w:w="4325" w:type="dxa"/>
+            <w:tcW w:w="3874" w:type="dxa"/>
             <w:tcBorders>
               <w:left w:val="single" w:sz="2" w:space="0" w:color="808080"/>
               <w:bottom w:val="single" w:sz="6" w:space="0" w:color="808080"/>
@@ -47354,7 +47629,7 @@
         </w:tc>
         <w:tc>
           <w:tcPr>
-            <w:tcW w:w="2486" w:type="dxa"/>
+            <w:tcW w:w="2245" w:type="dxa"/>
             <w:tcBorders>
               <w:left w:val="single" w:sz="2" w:space="0" w:color="808080"/>
               <w:bottom w:val="single" w:sz="6" w:space="0" w:color="808080"/>
@@ -47386,7 +47661,7 @@
         </w:tc>
         <w:tc>
           <w:tcPr>
-            <w:tcW w:w="2760" w:type="dxa"/>
+            <w:tcW w:w="3490" w:type="dxa"/>
             <w:tcBorders>
               <w:left w:val="single" w:sz="2" w:space="0" w:color="808080"/>
               <w:bottom w:val="single" w:sz="6" w:space="0" w:color="808080"/>

</xml_diff>